<commit_message>
Docs: thêm biểu đồ lớp
</commit_message>
<xml_diff>
--- a/document/PTTKHT Edudex Quiz.docx
+++ b/document/PTTKHT Edudex Quiz.docx
@@ -521,7 +521,7 @@
                         <pic:cNvPicPr/>
                       </pic:nvPicPr>
                       <pic:blipFill>
-                        <a:blip r:embed="rId6" cstate="print">
+                        <a:blip r:embed="rId8" cstate="print">
                           <a:extLst>
                             <a:ext uri="{28A0092B-C50C-407E-A947-70E740481C1C}">
                               <a14:useLocalDpi xmlns:a14="http://schemas.microsoft.com/office/drawing/2010/main" val="0"/>
@@ -565,7 +565,6 @@
               <w:bCs/>
               <w:sz w:val="40"/>
               <w:szCs w:val="40"/>
-              <w:lang w:val="en-US"/>
             </w:rPr>
           </w:pPr>
           <w:r>
@@ -574,7 +573,6 @@
               <w:bCs/>
               <w:sz w:val="40"/>
               <w:szCs w:val="40"/>
-              <w:lang w:val="en-US"/>
             </w:rPr>
             <w:lastRenderedPageBreak/>
             <w:t>LỜI NÓI ĐẦU</w:t>
@@ -588,13 +586,9 @@
               <w:bCs/>
               <w:sz w:val="40"/>
               <w:szCs w:val="40"/>
-              <w:lang w:val="en-US"/>
             </w:rPr>
           </w:pPr>
           <w:r>
-            <w:rPr>
-              <w:lang w:val="en-US"/>
-            </w:rPr>
             <w:t>…</w:t>
           </w:r>
           <w:r>
@@ -603,7 +597,6 @@
               <w:bCs/>
               <w:sz w:val="40"/>
               <w:szCs w:val="40"/>
-              <w:lang w:val="en-US"/>
             </w:rPr>
             <w:br w:type="page"/>
           </w:r>
@@ -613,7 +606,6 @@
               <w:bCs/>
               <w:sz w:val="40"/>
               <w:szCs w:val="40"/>
-              <w:lang w:val="en-US"/>
             </w:rPr>
             <w:lastRenderedPageBreak/>
             <w:t>MỤC LỤC</w:t>
@@ -626,13 +618,9 @@
               <w:bCs/>
               <w:sz w:val="40"/>
               <w:szCs w:val="40"/>
-              <w:lang w:val="en-US"/>
             </w:rPr>
           </w:pPr>
           <w:r>
-            <w:rPr>
-              <w:lang w:val="en-US"/>
-            </w:rPr>
             <w:t>…</w:t>
           </w:r>
           <w:r>
@@ -641,7 +629,6 @@
               <w:bCs/>
               <w:sz w:val="40"/>
               <w:szCs w:val="40"/>
-              <w:lang w:val="en-US"/>
             </w:rPr>
             <w:br w:type="page"/>
           </w:r>
@@ -653,7 +640,6 @@
               <w:bCs/>
               <w:sz w:val="40"/>
               <w:szCs w:val="40"/>
-              <w:lang w:val="en-US"/>
             </w:rPr>
           </w:pPr>
         </w:p>
@@ -662,15 +648,11 @@
             <w:tabs>
               <w:tab w:val="left" w:pos="3600"/>
             </w:tabs>
-            <w:rPr>
-              <w:lang w:val="en-US"/>
-            </w:rPr>
           </w:pPr>
           <w:r>
             <w:rPr>
               <w:b/>
               <w:bCs/>
-              <w:lang w:val="en-US"/>
             </w:rPr>
             <w:t>1. GIỚI THIỆU HỆ THỐNG EDUDEX QUIZ</w:t>
           </w:r>
@@ -683,14 +665,12 @@
             <w:rPr>
               <w:b/>
               <w:bCs/>
-              <w:lang w:val="en-US"/>
             </w:rPr>
           </w:pPr>
           <w:r>
             <w:rPr>
               <w:b/>
               <w:bCs/>
-              <w:lang w:val="en-US"/>
             </w:rPr>
             <w:t>1.1 Hoạt động tổ chức thi trắc nghiệm</w:t>
           </w:r>
@@ -700,38 +680,20 @@
             <w:tabs>
               <w:tab w:val="left" w:pos="3600"/>
             </w:tabs>
-            <w:rPr>
-              <w:lang w:val="en-US"/>
-            </w:rPr>
           </w:pPr>
           <w:r>
-            <w:rPr>
-              <w:lang w:val="en-US"/>
-            </w:rPr>
             <w:t xml:space="preserve">Theo </w:t>
           </w:r>
           <w:r>
-            <w:rPr>
-              <w:lang w:val="en-US"/>
-            </w:rPr>
             <w:t xml:space="preserve">khảo sát </w:t>
           </w:r>
           <w:r>
-            <w:rPr>
-              <w:lang w:val="en-US"/>
-            </w:rPr>
             <w:t xml:space="preserve">quy trình tổ chức thi trắc nghiệm nội bộ của </w:t>
           </w:r>
           <w:r>
-            <w:rPr>
-              <w:lang w:val="en-US"/>
-            </w:rPr>
             <w:t>trường cao đẳng công nghệ bách khoa Hà Nội (HPC)</w:t>
           </w:r>
           <w:r>
-            <w:rPr>
-              <w:lang w:val="en-US"/>
-            </w:rPr>
             <w:t>, hoạt động có thể được tóm tắt như sau:</w:t>
           </w:r>
         </w:p>
@@ -744,35 +706,16 @@
             <w:tabs>
               <w:tab w:val="left" w:pos="3600"/>
             </w:tabs>
-            <w:rPr>
-              <w:lang w:val="en-US"/>
-            </w:rPr>
           </w:pPr>
           <w:r>
             <w:rPr>
               <w:b/>
               <w:bCs/>
-              <w:lang w:val="en-US"/>
             </w:rPr>
             <w:t>Xây dựng ngân hàng câu hỏi</w:t>
           </w:r>
           <w:r>
-            <w:rPr>
-              <w:lang w:val="en-US"/>
-            </w:rPr>
-            <w:t>: Giáo viên chuẩn bị các câu hỏi bằng cách soạn thảo trên giấy hoặc file Word/Excel, bao gồm đầy đủ thông tin như nội dung câu hỏi, đáp án đúng, mức độ khó</w:t>
-          </w:r>
-          <w:r>
-            <w:rPr>
-              <w:lang w:val="en-US"/>
-            </w:rPr>
-            <w:t xml:space="preserve">.. </w:t>
-          </w:r>
-          <w:r>
-            <w:rPr>
-              <w:lang w:val="en-US"/>
-            </w:rPr>
-            <w:t>Các câu hỏi này được in hoặc lưu trữ trong máy tính</w:t>
+            <w:t>: Giáo viên chuẩn bị các câu hỏi bằng cách soạn thảo trên giấy hoặc file Word/Excel, bao gồm đầy đủ thông tin như nội dung câu hỏi, đáp án đúng, mức độ khó.. Các câu hỏi này được in hoặc lưu trữ trong máy tính</w:t>
           </w:r>
         </w:p>
         <w:p>
@@ -784,22 +727,15 @@
             <w:tabs>
               <w:tab w:val="left" w:pos="3600"/>
             </w:tabs>
-            <w:rPr>
-              <w:lang w:val="en-US"/>
-            </w:rPr>
           </w:pPr>
           <w:r>
             <w:rPr>
               <w:b/>
               <w:bCs/>
-              <w:lang w:val="en-US"/>
             </w:rPr>
             <w:t>Tạo đề thi</w:t>
           </w:r>
           <w:r>
-            <w:rPr>
-              <w:lang w:val="en-US"/>
-            </w:rPr>
             <w:t>: Giáo viên chọn lựa câu hỏi từ ngân hàng để xây dựng đề thi phù hợp, cân nhắc số lượng câu hỏi, mức độ khó và môn học. Các đề thi được in ra giấy gửi đến các phòng thi.</w:t>
           </w:r>
         </w:p>
@@ -812,22 +748,15 @@
             <w:tabs>
               <w:tab w:val="left" w:pos="3600"/>
             </w:tabs>
-            <w:rPr>
-              <w:lang w:val="en-US"/>
-            </w:rPr>
           </w:pPr>
           <w:r>
             <w:rPr>
               <w:b/>
               <w:bCs/>
-              <w:lang w:val="en-US"/>
             </w:rPr>
             <w:t>Phân công học sinh và phòng thi</w:t>
           </w:r>
           <w:r>
-            <w:rPr>
-              <w:lang w:val="en-US"/>
-            </w:rPr>
             <w:t>: Giáo viên quản lý danh sách học sinh dự thi bằng cách ghi chép tay hoặc sử dụng file Excel. Học sinh được sắp xếp vào các phòng thi dựa trên danh sách có sẵn.</w:t>
           </w:r>
         </w:p>
@@ -840,34 +769,21 @@
             <w:tabs>
               <w:tab w:val="left" w:pos="3600"/>
             </w:tabs>
-            <w:rPr>
-              <w:lang w:val="en-US"/>
-            </w:rPr>
           </w:pPr>
           <w:r>
             <w:rPr>
               <w:b/>
               <w:bCs/>
-              <w:lang w:val="en-US"/>
             </w:rPr>
             <w:t>Phát đề thi</w:t>
           </w:r>
           <w:r>
-            <w:rPr>
-              <w:lang w:val="en-US"/>
-            </w:rPr>
             <w:t>: Đề thi được phát thủ công dưới dạng giấy từng phòng thi</w:t>
           </w:r>
           <w:r>
-            <w:rPr>
-              <w:lang w:val="en-US"/>
-            </w:rPr>
             <w:t>, từng thí sinh</w:t>
           </w:r>
           <w:r>
-            <w:rPr>
-              <w:lang w:val="en-US"/>
-            </w:rPr>
             <w:t>. Giám thị kiểm tra và đảm bảo mỗi học sinh nhận đúng đề thi.</w:t>
           </w:r>
         </w:p>
@@ -880,58 +796,33 @@
             <w:tabs>
               <w:tab w:val="left" w:pos="3600"/>
             </w:tabs>
-            <w:rPr>
-              <w:lang w:val="en-US"/>
-            </w:rPr>
           </w:pPr>
           <w:r>
             <w:rPr>
               <w:b/>
               <w:bCs/>
-              <w:lang w:val="en-US"/>
             </w:rPr>
             <w:t>Làm bài và nộp bài</w:t>
           </w:r>
           <w:r>
-            <w:rPr>
-              <w:lang w:val="en-US"/>
-            </w:rPr>
             <w:t>: Học sinh làm bài thi trên giấy</w:t>
           </w:r>
           <w:r>
-            <w:rPr>
-              <w:lang w:val="en-US"/>
-            </w:rPr>
             <w:t>.</w:t>
           </w:r>
           <w:r>
-            <w:rPr>
-              <w:lang w:val="en-US"/>
-            </w:rPr>
             <w:t xml:space="preserve"> Khi hết thời gian, bài làm được thu lại thủ công </w:t>
           </w:r>
           <w:r>
-            <w:rPr>
-              <w:lang w:val="en-US"/>
-            </w:rPr>
             <w:t>do</w:t>
           </w:r>
           <w:r>
-            <w:rPr>
-              <w:lang w:val="en-US"/>
-            </w:rPr>
             <w:t xml:space="preserve"> </w:t>
           </w:r>
           <w:r>
-            <w:rPr>
-              <w:lang w:val="en-US"/>
-            </w:rPr>
             <w:t>cán bộ coi thi</w:t>
           </w:r>
           <w:r>
-            <w:rPr>
-              <w:lang w:val="en-US"/>
-            </w:rPr>
             <w:t>.</w:t>
           </w:r>
         </w:p>
@@ -952,15 +843,17 @@
             <w:rPr>
               <w:b/>
               <w:bCs/>
-              <w:lang w:val="en-US"/>
             </w:rPr>
             <w:t>Chấm bài</w:t>
+          </w:r>
+          <w:r>
+            <w:t xml:space="preserve">: Giáo viên chấm bài thủ công hoặc nhập đáp án vào máy tính để chấm điểm bán tự động. </w:t>
           </w:r>
           <w:r>
             <w:rPr>
               <w:lang w:val="en-US"/>
             </w:rPr>
-            <w:t>: Giáo viên chấm bài thủ công hoặc nhập đáp án vào máy tính để chấm điểm bán tự động. Kết quả được ghi lại trong sổ hoặc file Excel.</w:t>
+            <w:t>Kết quả được ghi lại trong sổ hoặc file Excel.</w:t>
           </w:r>
         </w:p>
         <w:p>
@@ -1962,7 +1855,23 @@
           <w:bCs/>
           <w:lang w:val="en-US"/>
         </w:rPr>
-        <w:t>21 Xây dựng biểu đồ use case</w:t>
+        <w:t>2</w:t>
+      </w:r>
+      <w:r>
+        <w:rPr>
+          <w:b/>
+          <w:bCs/>
+          <w:lang w:val="en-US"/>
+        </w:rPr>
+        <w:t>.</w:t>
+      </w:r>
+      <w:r>
+        <w:rPr>
+          <w:b/>
+          <w:bCs/>
+          <w:lang w:val="en-US"/>
+        </w:rPr>
+        <w:t>1 Xây dựng biểu đồ use case</w:t>
       </w:r>
     </w:p>
     <w:p>
@@ -2083,7 +1992,7 @@
                     <pic:cNvPicPr/>
                   </pic:nvPicPr>
                   <pic:blipFill>
-                    <a:blip r:embed="rId7">
+                    <a:blip r:embed="rId9">
                       <a:extLst>
                         <a:ext uri="{28A0092B-C50C-407E-A947-70E740481C1C}">
                           <a14:useLocalDpi xmlns:a14="http://schemas.microsoft.com/office/drawing/2010/main" val="0"/>
@@ -3259,6 +3168,7 @@
           <w:bCs/>
           <w:lang w:val="en-US"/>
         </w:rPr>
+        <w:lastRenderedPageBreak/>
         <w:t>Mở khóa tài khoản:</w:t>
       </w:r>
       <w:r>
@@ -3284,7 +3194,6 @@
           <w:bCs/>
           <w:lang w:val="en-US"/>
         </w:rPr>
-        <w:lastRenderedPageBreak/>
         <w:t>Tìm kiếm tài khoản:</w:t>
       </w:r>
       <w:r>
@@ -3612,6 +3521,7 @@
           <w:bCs/>
           <w:lang w:val="en-US"/>
         </w:rPr>
+        <w:lastRenderedPageBreak/>
         <w:t>Nhập/Xuất câu hỏi:</w:t>
       </w:r>
     </w:p>
@@ -3656,7 +3566,6 @@
           <w:bCs/>
           <w:lang w:val="en-US"/>
         </w:rPr>
-        <w:lastRenderedPageBreak/>
         <w:t>Xuất câu hỏi:</w:t>
       </w:r>
       <w:r>
@@ -4028,6 +3937,7 @@
           <w:bCs/>
           <w:lang w:val="en-US"/>
         </w:rPr>
+        <w:lastRenderedPageBreak/>
         <w:t>Phân công phòng thi:</w:t>
       </w:r>
       <w:r>
@@ -4084,7 +3994,6 @@
         <w:rPr>
           <w:lang w:val="en-US"/>
         </w:rPr>
-        <w:lastRenderedPageBreak/>
         <w:t>Giám sát trạng thái của từng phòng thi (đang thi, đã kết thúc, chưa bắt đầu).</w:t>
       </w:r>
     </w:p>
@@ -4426,6 +4335,7 @@
           <w:bCs/>
           <w:lang w:val="en-US"/>
         </w:rPr>
+        <w:lastRenderedPageBreak/>
         <w:t>Xóa ca thi:</w:t>
       </w:r>
       <w:r>
@@ -4464,7 +4374,6 @@
           <w:bCs/>
           <w:lang w:val="en-US"/>
         </w:rPr>
-        <w:lastRenderedPageBreak/>
         <w:t>Phân bổ phòng thi cho ca thi:</w:t>
       </w:r>
       <w:r>
@@ -4810,7 +4719,6 @@
         <w:rPr>
           <w:lang w:val="en-US"/>
         </w:rPr>
-        <w:lastRenderedPageBreak/>
         <w:t>Khi thí sinh hoàn thành bài thi, hệ thống tự động ghi nhận bài làm và lưu vào cơ sở dữ liệu.</w:t>
       </w:r>
     </w:p>
@@ -5093,6 +5001,7 @@
         <w:rPr>
           <w:lang w:val="en-US"/>
         </w:rPr>
+        <w:lastRenderedPageBreak/>
         <w:t>Giáo vụ có thể xem lịch sử bài làm để xác minh trường hợp đặc biệt hoặc khi có khiếu nại từ thí sinh.</w:t>
       </w:r>
     </w:p>
@@ -5129,7 +5038,6 @@
         <w:rPr>
           <w:lang w:val="en-US"/>
         </w:rPr>
-        <w:lastRenderedPageBreak/>
         <w:t>Dữ liệu bài làm được mã hóa để tránh gian lận hoặc sửa đổi trái phép.</w:t>
       </w:r>
     </w:p>
@@ -5468,6 +5376,7 @@
         <w:rPr>
           <w:lang w:val="en-US"/>
         </w:rPr>
+        <w:lastRenderedPageBreak/>
         <w:t>Thí sinh được phân vào các phòng thi thuộc ca thi theo danh sách có sẵn.</w:t>
       </w:r>
     </w:p>
@@ -5504,7 +5413,6 @@
           <w:bCs/>
           <w:lang w:val="en-US"/>
         </w:rPr>
-        <w:lastRenderedPageBreak/>
         <w:t>Theo dõi trạng thái thí sinh trong kỳ thi:</w:t>
       </w:r>
     </w:p>
@@ -5826,6 +5734,7 @@
         <w:rPr>
           <w:lang w:val="sv-SE"/>
         </w:rPr>
+        <w:lastRenderedPageBreak/>
         <w:t>Giáo vụ có thể tra cứu thông tin của từng thí sinh theo số báo danh, họ tên hoặc mã sinh viên.</w:t>
       </w:r>
     </w:p>
@@ -5894,7 +5803,6 @@
         <w:rPr>
           <w:lang w:val="en-US"/>
         </w:rPr>
-        <w:lastRenderedPageBreak/>
         <w:t>Ngày sinh</w:t>
       </w:r>
     </w:p>
@@ -6192,6 +6100,7 @@
         <w:rPr>
           <w:lang w:val="en-US"/>
         </w:rPr>
+        <w:lastRenderedPageBreak/>
         <w:t>Trạng thái hoàn thành bài thi</w:t>
       </w:r>
     </w:p>
@@ -6245,7 +6154,6 @@
         <w:rPr>
           <w:lang w:val="sv-SE"/>
         </w:rPr>
-        <w:lastRenderedPageBreak/>
         <w:t>Hệ thống cho phép xuất danh sách thí sinh kiểm tra theo kỳ thi, ca thi hoặc phòng thi dưới dạng Excel, PDF hoặc Word để phục vụ công tác kiểm tra, xác minh.</w:t>
       </w:r>
     </w:p>
@@ -6548,6 +6456,7 @@
         <w:rPr>
           <w:lang w:val="en-US"/>
         </w:rPr>
+        <w:lastRenderedPageBreak/>
         <w:t>Khi thí sinh đăng nhập lại, hệ thống sẽ khôi phục bài làm về trạng thái mới nhất.</w:t>
       </w:r>
     </w:p>
@@ -6601,7 +6510,6 @@
         <w:rPr>
           <w:lang w:val="en-US"/>
         </w:rPr>
-        <w:lastRenderedPageBreak/>
         <w:t>Nếu vi phạm nhiều lần, hệ thống có thể cảnh báo cán bộ coi thi hoặc tự động khóa bài thi.</w:t>
       </w:r>
     </w:p>
@@ -6925,6 +6833,7 @@
         <w:rPr>
           <w:lang w:val="en-US"/>
         </w:rPr>
+        <w:lastRenderedPageBreak/>
         <w:t>Điểm số của bài thi (nếu đã được chấm tự động hoặc chấm tay hoàn tất).</w:t>
       </w:r>
     </w:p>
@@ -6993,7 +6902,6 @@
         <w:rPr>
           <w:lang w:val="en-US"/>
         </w:rPr>
-        <w:lastRenderedPageBreak/>
         <w:t>Nếu bài thi có phần tự luận, kết quả sẽ chỉ hiển thị sau khi giáo vụ hoàn tất chấm điểm.</w:t>
       </w:r>
     </w:p>
@@ -7325,6 +7233,7 @@
           <w:bCs/>
           <w:lang w:val="en-US"/>
         </w:rPr>
+        <w:lastRenderedPageBreak/>
         <w:t>Bảo mật thông tin kết quả:</w:t>
       </w:r>
     </w:p>
@@ -7545,7 +7454,7 @@
                     <pic:cNvPicPr/>
                   </pic:nvPicPr>
                   <pic:blipFill>
-                    <a:blip r:embed="rId8">
+                    <a:blip r:embed="rId10">
                       <a:extLst>
                         <a:ext uri="{28A0092B-C50C-407E-A947-70E740481C1C}">
                           <a14:useLocalDpi xmlns:a14="http://schemas.microsoft.com/office/drawing/2010/main" val="0"/>
@@ -8223,6 +8132,7 @@
                 <w:sz w:val="28"/>
                 <w:szCs w:val="28"/>
               </w:rPr>
+              <w:lastRenderedPageBreak/>
               <w:t>Hệ thống hiển thị dữ liệu và giao diện hệ thống lên màn hình người dùng.</w:t>
             </w:r>
           </w:p>
@@ -8246,7 +8156,6 @@
                 <w:sz w:val="28"/>
                 <w:szCs w:val="28"/>
               </w:rPr>
-              <w:lastRenderedPageBreak/>
               <w:t>Nếu thông tin đăng nhập không hợp lệ:</w:t>
             </w:r>
           </w:p>
@@ -8619,6 +8528,7 @@
         <w:rPr>
           <w:lang w:val="en-US"/>
         </w:rPr>
+        <w:lastRenderedPageBreak/>
         <w:drawing>
           <wp:inline distT="0" distB="0" distL="0" distR="0" wp14:anchorId="2CDBC58A" wp14:editId="6DAD2209">
             <wp:extent cx="5401734" cy="3950662"/>
@@ -8635,7 +8545,7 @@
                     <pic:cNvPicPr/>
                   </pic:nvPicPr>
                   <pic:blipFill>
-                    <a:blip r:embed="rId9">
+                    <a:blip r:embed="rId11">
                       <a:extLst>
                         <a:ext uri="{28A0092B-C50C-407E-A947-70E740481C1C}">
                           <a14:useLocalDpi xmlns:a14="http://schemas.microsoft.com/office/drawing/2010/main" val="0"/>
@@ -8718,7 +8628,6 @@
           <w:rFonts w:cs="Times New Roman"/>
           <w:lang w:val="en-US"/>
         </w:rPr>
-        <w:lastRenderedPageBreak/>
         <w:t xml:space="preserve">- </w:t>
       </w:r>
       <w:r>
@@ -9279,6 +9188,7 @@
                 <w:sz w:val="28"/>
                 <w:szCs w:val="28"/>
               </w:rPr>
+              <w:lastRenderedPageBreak/>
               <w:t>Nếu thông tin đăng nhập hợp lệ:</w:t>
             </w:r>
           </w:p>
@@ -9374,6 +9284,7 @@
                 <w:sz w:val="28"/>
                 <w:szCs w:val="28"/>
               </w:rPr>
+              <w:lastRenderedPageBreak/>
               <w:t>Luồng phụ A1: thông tin đăng nhập không hợp lệ.</w:t>
             </w:r>
           </w:p>
@@ -9612,7 +9523,6 @@
                 <w:sz w:val="28"/>
                 <w:szCs w:val="28"/>
               </w:rPr>
-              <w:lastRenderedPageBreak/>
               <w:t>Hệ thống trả về trạng thái trước đó.</w:t>
             </w:r>
           </w:p>
@@ -9710,6 +9620,7 @@
         <w:rPr>
           <w:lang w:val="en-US"/>
         </w:rPr>
+        <w:lastRenderedPageBreak/>
         <w:drawing>
           <wp:inline distT="0" distB="0" distL="0" distR="0" wp14:anchorId="5713FA55" wp14:editId="6780FBAE">
             <wp:extent cx="5600700" cy="4019550"/>
@@ -9726,7 +9637,7 @@
                     <pic:cNvPicPr/>
                   </pic:nvPicPr>
                   <pic:blipFill>
-                    <a:blip r:embed="rId10">
+                    <a:blip r:embed="rId12">
                       <a:extLst>
                         <a:ext uri="{28A0092B-C50C-407E-A947-70E740481C1C}">
                           <a14:useLocalDpi xmlns:a14="http://schemas.microsoft.com/office/drawing/2010/main" val="0"/>
@@ -9929,7 +9840,7 @@
                     <pic:cNvPicPr/>
                   </pic:nvPicPr>
                   <pic:blipFill>
-                    <a:blip r:embed="rId11">
+                    <a:blip r:embed="rId13">
                       <a:extLst>
                         <a:ext uri="{28A0092B-C50C-407E-A947-70E740481C1C}">
                           <a14:useLocalDpi xmlns:a14="http://schemas.microsoft.com/office/drawing/2010/main" val="0"/>
@@ -10138,7 +10049,7 @@
                     <pic:cNvPicPr/>
                   </pic:nvPicPr>
                   <pic:blipFill>
-                    <a:blip r:embed="rId12">
+                    <a:blip r:embed="rId14">
                       <a:extLst>
                         <a:ext uri="{28A0092B-C50C-407E-A947-70E740481C1C}">
                           <a14:useLocalDpi xmlns:a14="http://schemas.microsoft.com/office/drawing/2010/main" val="0"/>
@@ -10342,7 +10253,7 @@
                     <pic:cNvPicPr/>
                   </pic:nvPicPr>
                   <pic:blipFill>
-                    <a:blip r:embed="rId13">
+                    <a:blip r:embed="rId15">
                       <a:extLst>
                         <a:ext uri="{28A0092B-C50C-407E-A947-70E740481C1C}">
                           <a14:useLocalDpi xmlns:a14="http://schemas.microsoft.com/office/drawing/2010/main" val="0"/>
@@ -10466,15 +10377,7 @@
           <w:bCs/>
           <w:lang w:val="en-US"/>
         </w:rPr>
-        <w:t>ca</w:t>
-      </w:r>
-      <w:r>
-        <w:rPr>
-          <w:b/>
-          <w:bCs/>
-          <w:lang w:val="en-US"/>
-        </w:rPr>
-        <w:t xml:space="preserve"> thi</w:t>
+        <w:t>ca thi</w:t>
       </w:r>
     </w:p>
     <w:p>
@@ -10493,13 +10396,7 @@
         <w:rPr>
           <w:lang w:val="en-US"/>
         </w:rPr>
-        <w:t>ca</w:t>
-      </w:r>
-      <w:r>
-        <w:rPr>
-          <w:lang w:val="en-US"/>
-        </w:rPr>
-        <w:t xml:space="preserve"> thi</w:t>
+        <w:t>ca thi</w:t>
       </w:r>
       <w:r>
         <w:rPr>
@@ -10566,7 +10463,7 @@
                     <pic:cNvPicPr/>
                   </pic:nvPicPr>
                   <pic:blipFill>
-                    <a:blip r:embed="rId14">
+                    <a:blip r:embed="rId16">
                       <a:extLst>
                         <a:ext uri="{28A0092B-C50C-407E-A947-70E740481C1C}">
                           <a14:useLocalDpi xmlns:a14="http://schemas.microsoft.com/office/drawing/2010/main" val="0"/>
@@ -10634,19 +10531,7 @@
         <w:rPr>
           <w:lang w:val="en-US"/>
         </w:rPr>
-        <w:t xml:space="preserve">Quản </w:t>
-      </w:r>
-      <w:r>
-        <w:rPr>
-          <w:lang w:val="en-US"/>
-        </w:rPr>
-        <w:t>ca</w:t>
-      </w:r>
-      <w:r>
-        <w:rPr>
-          <w:lang w:val="en-US"/>
-        </w:rPr>
-        <w:t xml:space="preserve"> thi</w:t>
+        <w:t>Quản ca thi</w:t>
       </w:r>
     </w:p>
     <w:p>
@@ -10720,19 +10605,7 @@
         <w:rPr>
           <w:lang w:val="en-US"/>
         </w:rPr>
-        <w:t>giáo vụ</w:t>
-      </w:r>
-      <w:r>
-        <w:rPr>
-          <w:lang w:val="en-US"/>
-        </w:rPr>
-        <w:t xml:space="preserve"> và cán bộ coi thi</w:t>
-      </w:r>
-      <w:r>
-        <w:rPr>
-          <w:lang w:val="en-US"/>
-        </w:rPr>
-        <w:t xml:space="preserve"> </w:t>
+        <w:t xml:space="preserve">giáo vụ và cán bộ coi thi </w:t>
       </w:r>
       <w:r>
         <w:rPr>
@@ -10787,7 +10660,7 @@
                     <pic:cNvPicPr/>
                   </pic:nvPicPr>
                   <pic:blipFill>
-                    <a:blip r:embed="rId15">
+                    <a:blip r:embed="rId17">
                       <a:extLst>
                         <a:ext uri="{28A0092B-C50C-407E-A947-70E740481C1C}">
                           <a14:useLocalDpi xmlns:a14="http://schemas.microsoft.com/office/drawing/2010/main" val="0"/>
@@ -11009,7 +10882,7 @@
                     <pic:cNvPicPr/>
                   </pic:nvPicPr>
                   <pic:blipFill>
-                    <a:blip r:embed="rId16">
+                    <a:blip r:embed="rId18">
                       <a:extLst>
                         <a:ext uri="{28A0092B-C50C-407E-A947-70E740481C1C}">
                           <a14:useLocalDpi xmlns:a14="http://schemas.microsoft.com/office/drawing/2010/main" val="0"/>
@@ -11077,13 +10950,7 @@
         <w:rPr>
           <w:lang w:val="en-US"/>
         </w:rPr>
-        <w:t xml:space="preserve">Quản </w:t>
-      </w:r>
-      <w:r>
-        <w:rPr>
-          <w:lang w:val="en-US"/>
-        </w:rPr>
-        <w:t>lý thí sinh</w:t>
+        <w:t>Quản lý thí sinh</w:t>
       </w:r>
     </w:p>
     <w:p>
@@ -11157,13 +11024,7 @@
         <w:rPr>
           <w:lang w:val="en-US"/>
         </w:rPr>
-        <w:t>thí sinh</w:t>
-      </w:r>
-      <w:r>
-        <w:rPr>
-          <w:lang w:val="en-US"/>
-        </w:rPr>
-        <w:t xml:space="preserve"> </w:t>
+        <w:t xml:space="preserve">thí sinh </w:t>
       </w:r>
       <w:r>
         <w:rPr>
@@ -11175,13 +11036,7 @@
         <w:rPr>
           <w:lang w:val="en-US"/>
         </w:rPr>
-        <w:t>1</w:t>
-      </w:r>
-      <w:r>
-        <w:rPr>
-          <w:lang w:val="en-US"/>
-        </w:rPr>
-        <w:t>1</w:t>
+        <w:t>11</w:t>
       </w:r>
       <w:r>
         <w:rPr>
@@ -11224,7 +11079,7 @@
                     <pic:cNvPicPr/>
                   </pic:nvPicPr>
                   <pic:blipFill>
-                    <a:blip r:embed="rId17">
+                    <a:blip r:embed="rId19">
                       <a:extLst>
                         <a:ext uri="{28A0092B-C50C-407E-A947-70E740481C1C}">
                           <a14:useLocalDpi xmlns:a14="http://schemas.microsoft.com/office/drawing/2010/main" val="0"/>
@@ -11386,13 +11241,7 @@
         <w:rPr>
           <w:lang w:val="en-US"/>
         </w:rPr>
-        <w:t>1</w:t>
-      </w:r>
-      <w:r>
-        <w:rPr>
-          <w:lang w:val="en-US"/>
-        </w:rPr>
-        <w:t>2</w:t>
+        <w:t>12</w:t>
       </w:r>
       <w:r>
         <w:rPr>
@@ -11435,7 +11284,7 @@
                     <pic:cNvPicPr/>
                   </pic:nvPicPr>
                   <pic:blipFill>
-                    <a:blip r:embed="rId18">
+                    <a:blip r:embed="rId20">
                       <a:extLst>
                         <a:ext uri="{28A0092B-C50C-407E-A947-70E740481C1C}">
                           <a14:useLocalDpi xmlns:a14="http://schemas.microsoft.com/office/drawing/2010/main" val="0"/>
@@ -11483,15 +11332,7 @@
           <w:bCs/>
           <w:lang w:val="en-US"/>
         </w:rPr>
-        <w:t>1</w:t>
-      </w:r>
-      <w:r>
-        <w:rPr>
-          <w:b/>
-          <w:bCs/>
-          <w:lang w:val="en-US"/>
-        </w:rPr>
-        <w:t>2</w:t>
+        <w:t>12</w:t>
       </w:r>
       <w:r>
         <w:rPr>
@@ -11604,13 +11445,7 @@
         <w:rPr>
           <w:lang w:val="en-US"/>
         </w:rPr>
-        <w:t>1</w:t>
-      </w:r>
-      <w:r>
-        <w:rPr>
-          <w:lang w:val="en-US"/>
-        </w:rPr>
-        <w:t>3</w:t>
+        <w:t>13</w:t>
       </w:r>
       <w:r>
         <w:rPr>
@@ -11653,7 +11488,7 @@
                     <pic:cNvPicPr/>
                   </pic:nvPicPr>
                   <pic:blipFill>
-                    <a:blip r:embed="rId19">
+                    <a:blip r:embed="rId21">
                       <a:extLst>
                         <a:ext uri="{28A0092B-C50C-407E-A947-70E740481C1C}">
                           <a14:useLocalDpi xmlns:a14="http://schemas.microsoft.com/office/drawing/2010/main" val="0"/>
@@ -11701,15 +11536,7 @@
           <w:bCs/>
           <w:lang w:val="en-US"/>
         </w:rPr>
-        <w:t>1</w:t>
-      </w:r>
-      <w:r>
-        <w:rPr>
-          <w:b/>
-          <w:bCs/>
-          <w:lang w:val="en-US"/>
-        </w:rPr>
-        <w:t>3</w:t>
+        <w:t>13</w:t>
       </w:r>
       <w:r>
         <w:rPr>
@@ -11877,7 +11704,7 @@
                     <pic:cNvPicPr/>
                   </pic:nvPicPr>
                   <pic:blipFill>
-                    <a:blip r:embed="rId20">
+                    <a:blip r:embed="rId22">
                       <a:extLst>
                         <a:ext uri="{28A0092B-C50C-407E-A947-70E740481C1C}">
                           <a14:useLocalDpi xmlns:a14="http://schemas.microsoft.com/office/drawing/2010/main" val="0"/>
@@ -11953,13 +11780,7 @@
         <w:rPr>
           <w:lang w:val="en-US"/>
         </w:rPr>
-        <w:t xml:space="preserve">case </w:t>
-      </w:r>
-      <w:r>
-        <w:rPr>
-          <w:lang w:val="en-US"/>
-        </w:rPr>
-        <w:t>Xem kết quả</w:t>
+        <w:t>case Xem kết quả</w:t>
       </w:r>
     </w:p>
     <w:p>
@@ -11992,11 +11813,191 @@
     <w:p>
       <w:pPr>
         <w:rPr>
+          <w:b/>
+          <w:bCs/>
+          <w:lang w:val="en-US"/>
+        </w:rPr>
+      </w:pPr>
+      <w:r>
+        <w:rPr>
+          <w:b/>
+          <w:bCs/>
+          <w:lang w:val="en-US"/>
+        </w:rPr>
+        <w:t>2.2 Xây dựng biểu đồ lớp phân tích</w:t>
+      </w:r>
+    </w:p>
+    <w:p>
+      <w:pPr>
+        <w:rPr>
+          <w:lang w:val="en-US"/>
+        </w:rPr>
+      </w:pPr>
+      <w:r>
+        <w:rPr>
+          <w:lang w:val="en-US"/>
+        </w:rPr>
+        <w:t>Biểu đồ lớp phân tích được xây dựng hoàn toàn tượng tự như đã trình bày trong chương 3 của tài liệu này.</w:t>
+      </w:r>
+    </w:p>
+    <w:p>
+      <w:pPr>
+        <w:rPr>
+          <w:lang w:val="en-US"/>
+        </w:rPr>
+      </w:pPr>
+    </w:p>
+    <w:p>
+      <w:pPr>
+        <w:rPr>
+          <w:lang w:val="en-US"/>
+        </w:rPr>
+      </w:pPr>
+      <w:r>
+        <w:rPr>
+          <w:lang w:val="en-US"/>
+        </w:rPr>
+        <w:drawing>
+          <wp:inline distT="0" distB="0" distL="0" distR="0" wp14:anchorId="307CF212" wp14:editId="75E5F63D">
+            <wp:extent cx="5760720" cy="2707640"/>
+            <wp:effectExtent l="0" t="0" r="0" b="0"/>
+            <wp:docPr id="1429842063" name="Picture 5" descr="A screenshot of a computer screen&#10;&#10;Description automatically generated"/>
+            <wp:cNvGraphicFramePr>
+              <a:graphicFrameLocks xmlns:a="http://schemas.openxmlformats.org/drawingml/2006/main" noChangeAspect="1"/>
+            </wp:cNvGraphicFramePr>
+            <a:graphic xmlns:a="http://schemas.openxmlformats.org/drawingml/2006/main">
+              <a:graphicData uri="http://schemas.openxmlformats.org/drawingml/2006/picture">
+                <pic:pic xmlns:pic="http://schemas.openxmlformats.org/drawingml/2006/picture">
+                  <pic:nvPicPr>
+                    <pic:cNvPr id="1429842063" name="Picture 5" descr="A screenshot of a computer screen&#10;&#10;Description automatically generated"/>
+                    <pic:cNvPicPr/>
+                  </pic:nvPicPr>
+                  <pic:blipFill>
+                    <a:blip r:embed="rId23">
+                      <a:extLst>
+                        <a:ext uri="{28A0092B-C50C-407E-A947-70E740481C1C}">
+                          <a14:useLocalDpi xmlns:a14="http://schemas.microsoft.com/office/drawing/2010/main" val="0"/>
+                        </a:ext>
+                      </a:extLst>
+                    </a:blip>
+                    <a:stretch>
+                      <a:fillRect/>
+                    </a:stretch>
+                  </pic:blipFill>
+                  <pic:spPr>
+                    <a:xfrm>
+                      <a:off x="0" y="0"/>
+                      <a:ext cx="5760720" cy="2707640"/>
+                    </a:xfrm>
+                    <a:prstGeom prst="rect">
+                      <a:avLst/>
+                    </a:prstGeom>
+                  </pic:spPr>
+                </pic:pic>
+              </a:graphicData>
+            </a:graphic>
+          </wp:inline>
+        </w:drawing>
+      </w:r>
+    </w:p>
+    <w:p>
+      <w:pPr>
+        <w:rPr>
+          <w:b/>
+          <w:bCs/>
+          <w:lang w:val="en-US"/>
+        </w:rPr>
+      </w:pPr>
+    </w:p>
+    <w:p>
+      <w:pPr>
+        <w:jc w:val="center"/>
+        <w:rPr>
+          <w:lang w:val="en-US"/>
+        </w:rPr>
+      </w:pPr>
+      <w:r>
+        <w:rPr>
+          <w:b/>
+          <w:bCs/>
+          <w:lang w:val="en-US"/>
+        </w:rPr>
+        <w:t>Hình P.</w:t>
+      </w:r>
+      <w:r>
+        <w:rPr>
+          <w:b/>
+          <w:bCs/>
+          <w:lang w:val="en-US"/>
+        </w:rPr>
+        <w:t>15</w:t>
+      </w:r>
+      <w:r>
+        <w:rPr>
+          <w:b/>
+          <w:bCs/>
+          <w:lang w:val="en-US"/>
+        </w:rPr>
+        <w:t>:</w:t>
+      </w:r>
+      <w:r>
+        <w:rPr>
+          <w:lang w:val="en-US"/>
+        </w:rPr>
+        <w:t xml:space="preserve"> Biểu đồ lớp phân tích của hệ thống</w:t>
+      </w:r>
+    </w:p>
+    <w:p>
+      <w:pPr>
+        <w:rPr>
+          <w:lang w:val="en-US"/>
+        </w:rPr>
+      </w:pPr>
+    </w:p>
+    <w:p>
+      <w:pPr>
+        <w:rPr>
+          <w:lang w:val="en-US"/>
+        </w:rPr>
+      </w:pPr>
+      <w:r>
+        <w:rPr>
+          <w:lang w:val="en-US"/>
+        </w:rPr>
+        <w:br w:type="column"/>
+      </w:r>
+      <w:r>
+        <w:rPr>
+          <w:b/>
+          <w:bCs/>
+          <w:lang w:val="en-US"/>
+        </w:rPr>
+        <w:lastRenderedPageBreak/>
+        <w:t>2.3 Biểu đồ trạng thái</w:t>
+      </w:r>
+    </w:p>
+    <w:p>
+      <w:pPr>
+        <w:rPr>
+          <w:lang w:val="en-US"/>
+        </w:rPr>
+      </w:pPr>
+      <w:r>
+        <w:rPr>
+          <w:lang w:val="en-US"/>
+        </w:rPr>
+        <w:t xml:space="preserve">Phần này trình bày hai biểu đồ trạng thái cho lớp </w:t>
+      </w:r>
+    </w:p>
+    <w:p>
+      <w:pPr>
+        <w:rPr>
           <w:lang w:val="en-US"/>
         </w:rPr>
       </w:pPr>
     </w:p>
     <w:sectPr>
+      <w:footerReference w:type="default" r:id="rId24"/>
       <w:pgSz w:w="11907" w:h="16840" w:code="9"/>
       <w:pgMar w:top="1134" w:right="1134" w:bottom="1134" w:left="1701" w:header="720" w:footer="720" w:gutter="0"/>
       <w:pgNumType w:start="0"/>
@@ -12006,6 +12007,112 @@
     </w:sectPr>
   </w:body>
 </w:document>
+</file>
+
+<file path=word/endnotes.xml><?xml version="1.0" encoding="utf-8"?>
+<w:endnotes xmlns:wpc="http://schemas.microsoft.com/office/word/2010/wordprocessingCanvas" xmlns:cx="http://schemas.microsoft.com/office/drawing/2014/chartex" xmlns:cx1="http://schemas.microsoft.com/office/drawing/2015/9/8/chartex" xmlns:cx2="http://schemas.microsoft.com/office/drawing/2015/10/21/chartex" xmlns:cx3="http://schemas.microsoft.com/office/drawing/2016/5/9/chartex" xmlns:cx4="http://schemas.microsoft.com/office/drawing/2016/5/10/chartex" xmlns:cx5="http://schemas.microsoft.com/office/drawing/2016/5/11/chartex" xmlns:cx6="http://schemas.microsoft.com/office/drawing/2016/5/12/chartex" xmlns:cx7="http://schemas.microsoft.com/office/drawing/2016/5/13/chartex" xmlns:cx8="http://schemas.microsoft.com/office/drawing/2016/5/14/chartex" xmlns:mc="http://schemas.openxmlformats.org/markup-compatibility/2006" xmlns:aink="http://schemas.microsoft.com/office/drawing/2016/ink" xmlns:am3d="http://schemas.microsoft.com/office/drawing/2017/model3d" xmlns:o="urn:schemas-microsoft-com:office:office" xmlns:oel="http://schemas.microsoft.com/office/2019/extlst" xmlns:r="http://schemas.openxmlformats.org/officeDocument/2006/relationships" xmlns:m="http://schemas.openxmlformats.org/officeDocument/2006/math" xmlns:v="urn:schemas-microsoft-com:vml" xmlns:wp14="http://schemas.microsoft.com/office/word/2010/wordprocessingDrawing" xmlns:wp="http://schemas.openxmlformats.org/drawingml/2006/wordprocessingDrawing" xmlns:w10="urn:schemas-microsoft-com:office:word" xmlns:w="http://schemas.openxmlformats.org/wordprocessingml/2006/main" xmlns:w14="http://schemas.microsoft.com/office/word/2010/wordml" xmlns:w15="http://schemas.microsoft.com/office/word/2012/wordml" xmlns:w16cex="http://schemas.microsoft.com/office/word/2018/wordml/cex" xmlns:w16cid="http://schemas.microsoft.com/office/word/2016/wordml/cid" xmlns:w16="http://schemas.microsoft.com/office/word/2018/wordml" xmlns:w16du="http://schemas.microsoft.com/office/word/2023/wordml/word16du" xmlns:w16sdtdh="http://schemas.microsoft.com/office/word/2020/wordml/sdtdatahash" xmlns:w16sdtfl="http://schemas.microsoft.com/office/word/2024/wordml/sdtformatlock" xmlns:w16se="http://schemas.microsoft.com/office/word/2015/wordml/symex" xmlns:wpg="http://schemas.microsoft.com/office/word/2010/wordprocessingGroup" xmlns:wpi="http://schemas.microsoft.com/office/word/2010/wordprocessingInk" xmlns:wne="http://schemas.microsoft.com/office/word/2006/wordml" xmlns:wps="http://schemas.microsoft.com/office/word/2010/wordprocessingShape" mc:Ignorable="w14 w15 w16se w16cid w16 w16cex w16sdtdh w16sdtfl w16du wp14">
+  <w:endnote w:type="separator" w:id="-1">
+    <w:p>
+      <w:pPr>
+        <w:spacing w:after="0" w:line="240" w:lineRule="auto"/>
+      </w:pPr>
+      <w:r>
+        <w:separator/>
+      </w:r>
+    </w:p>
+  </w:endnote>
+  <w:endnote w:type="continuationSeparator" w:id="0">
+    <w:p>
+      <w:pPr>
+        <w:spacing w:after="0" w:line="240" w:lineRule="auto"/>
+      </w:pPr>
+      <w:r>
+        <w:continuationSeparator/>
+      </w:r>
+    </w:p>
+  </w:endnote>
+</w:endnotes>
+</file>
+
+<file path=word/footer1.xml><?xml version="1.0" encoding="utf-8"?>
+<w:ftr xmlns:wpc="http://schemas.microsoft.com/office/word/2010/wordprocessingCanvas" xmlns:cx="http://schemas.microsoft.com/office/drawing/2014/chartex" xmlns:cx1="http://schemas.microsoft.com/office/drawing/2015/9/8/chartex" xmlns:cx2="http://schemas.microsoft.com/office/drawing/2015/10/21/chartex" xmlns:cx3="http://schemas.microsoft.com/office/drawing/2016/5/9/chartex" xmlns:cx4="http://schemas.microsoft.com/office/drawing/2016/5/10/chartex" xmlns:cx5="http://schemas.microsoft.com/office/drawing/2016/5/11/chartex" xmlns:cx6="http://schemas.microsoft.com/office/drawing/2016/5/12/chartex" xmlns:cx7="http://schemas.microsoft.com/office/drawing/2016/5/13/chartex" xmlns:cx8="http://schemas.microsoft.com/office/drawing/2016/5/14/chartex" xmlns:mc="http://schemas.openxmlformats.org/markup-compatibility/2006" xmlns:aink="http://schemas.microsoft.com/office/drawing/2016/ink" xmlns:am3d="http://schemas.microsoft.com/office/drawing/2017/model3d" xmlns:o="urn:schemas-microsoft-com:office:office" xmlns:oel="http://schemas.microsoft.com/office/2019/extlst" xmlns:r="http://schemas.openxmlformats.org/officeDocument/2006/relationships" xmlns:m="http://schemas.openxmlformats.org/officeDocument/2006/math" xmlns:v="urn:schemas-microsoft-com:vml" xmlns:wp14="http://schemas.microsoft.com/office/word/2010/wordprocessingDrawing" xmlns:wp="http://schemas.openxmlformats.org/drawingml/2006/wordprocessingDrawing" xmlns:w10="urn:schemas-microsoft-com:office:word" xmlns:w="http://schemas.openxmlformats.org/wordprocessingml/2006/main" xmlns:w14="http://schemas.microsoft.com/office/word/2010/wordml" xmlns:w15="http://schemas.microsoft.com/office/word/2012/wordml" xmlns:w16cex="http://schemas.microsoft.com/office/word/2018/wordml/cex" xmlns:w16cid="http://schemas.microsoft.com/office/word/2016/wordml/cid" xmlns:w16="http://schemas.microsoft.com/office/word/2018/wordml" xmlns:w16du="http://schemas.microsoft.com/office/word/2023/wordml/word16du" xmlns:w16sdtdh="http://schemas.microsoft.com/office/word/2020/wordml/sdtdatahash" xmlns:w16sdtfl="http://schemas.microsoft.com/office/word/2024/wordml/sdtformatlock" xmlns:w16se="http://schemas.microsoft.com/office/word/2015/wordml/symex" xmlns:wpg="http://schemas.microsoft.com/office/word/2010/wordprocessingGroup" xmlns:wpi="http://schemas.microsoft.com/office/word/2010/wordprocessingInk" xmlns:wne="http://schemas.microsoft.com/office/word/2006/wordml" xmlns:wps="http://schemas.microsoft.com/office/word/2010/wordprocessingShape" mc:Ignorable="w14 w15 w16se w16cid w16 w16cex w16sdtdh w16sdtfl w16du wp14">
+  <w:sdt>
+    <w:sdtPr>
+      <w:rPr>
+        <w:noProof w:val="0"/>
+      </w:rPr>
+      <w:id w:val="-1801059396"/>
+      <w:docPartObj>
+        <w:docPartGallery w:val="Page Numbers (Bottom of Page)"/>
+        <w:docPartUnique/>
+      </w:docPartObj>
+    </w:sdtPr>
+    <w:sdtEndPr>
+      <w:rPr>
+        <w:noProof/>
+      </w:rPr>
+    </w:sdtEndPr>
+    <w:sdtContent>
+      <w:p>
+        <w:pPr>
+          <w:pStyle w:val="Footer"/>
+          <w:jc w:val="center"/>
+        </w:pPr>
+        <w:r>
+          <w:rPr>
+            <w:noProof w:val="0"/>
+          </w:rPr>
+          <w:fldChar w:fldCharType="begin"/>
+        </w:r>
+        <w:r>
+          <w:instrText xml:space="preserve"> PAGE   \* MERGEFORMAT </w:instrText>
+        </w:r>
+        <w:r>
+          <w:rPr>
+            <w:noProof w:val="0"/>
+          </w:rPr>
+          <w:fldChar w:fldCharType="separate"/>
+        </w:r>
+        <w:r>
+          <w:t>2</w:t>
+        </w:r>
+        <w:r>
+          <w:fldChar w:fldCharType="end"/>
+        </w:r>
+      </w:p>
+    </w:sdtContent>
+  </w:sdt>
+  <w:p>
+    <w:pPr>
+      <w:pStyle w:val="Footer"/>
+    </w:pPr>
+  </w:p>
+</w:ftr>
+</file>
+
+<file path=word/footnotes.xml><?xml version="1.0" encoding="utf-8"?>
+<w:footnotes xmlns:wpc="http://schemas.microsoft.com/office/word/2010/wordprocessingCanvas" xmlns:cx="http://schemas.microsoft.com/office/drawing/2014/chartex" xmlns:cx1="http://schemas.microsoft.com/office/drawing/2015/9/8/chartex" xmlns:cx2="http://schemas.microsoft.com/office/drawing/2015/10/21/chartex" xmlns:cx3="http://schemas.microsoft.com/office/drawing/2016/5/9/chartex" xmlns:cx4="http://schemas.microsoft.com/office/drawing/2016/5/10/chartex" xmlns:cx5="http://schemas.microsoft.com/office/drawing/2016/5/11/chartex" xmlns:cx6="http://schemas.microsoft.com/office/drawing/2016/5/12/chartex" xmlns:cx7="http://schemas.microsoft.com/office/drawing/2016/5/13/chartex" xmlns:cx8="http://schemas.microsoft.com/office/drawing/2016/5/14/chartex" xmlns:mc="http://schemas.openxmlformats.org/markup-compatibility/2006" xmlns:aink="http://schemas.microsoft.com/office/drawing/2016/ink" xmlns:am3d="http://schemas.microsoft.com/office/drawing/2017/model3d" xmlns:o="urn:schemas-microsoft-com:office:office" xmlns:oel="http://schemas.microsoft.com/office/2019/extlst" xmlns:r="http://schemas.openxmlformats.org/officeDocument/2006/relationships" xmlns:m="http://schemas.openxmlformats.org/officeDocument/2006/math" xmlns:v="urn:schemas-microsoft-com:vml" xmlns:wp14="http://schemas.microsoft.com/office/word/2010/wordprocessingDrawing" xmlns:wp="http://schemas.openxmlformats.org/drawingml/2006/wordprocessingDrawing" xmlns:w10="urn:schemas-microsoft-com:office:word" xmlns:w="http://schemas.openxmlformats.org/wordprocessingml/2006/main" xmlns:w14="http://schemas.microsoft.com/office/word/2010/wordml" xmlns:w15="http://schemas.microsoft.com/office/word/2012/wordml" xmlns:w16cex="http://schemas.microsoft.com/office/word/2018/wordml/cex" xmlns:w16cid="http://schemas.microsoft.com/office/word/2016/wordml/cid" xmlns:w16="http://schemas.microsoft.com/office/word/2018/wordml" xmlns:w16du="http://schemas.microsoft.com/office/word/2023/wordml/word16du" xmlns:w16sdtdh="http://schemas.microsoft.com/office/word/2020/wordml/sdtdatahash" xmlns:w16sdtfl="http://schemas.microsoft.com/office/word/2024/wordml/sdtformatlock" xmlns:w16se="http://schemas.microsoft.com/office/word/2015/wordml/symex" xmlns:wpg="http://schemas.microsoft.com/office/word/2010/wordprocessingGroup" xmlns:wpi="http://schemas.microsoft.com/office/word/2010/wordprocessingInk" xmlns:wne="http://schemas.microsoft.com/office/word/2006/wordml" xmlns:wps="http://schemas.microsoft.com/office/word/2010/wordprocessingShape" mc:Ignorable="w14 w15 w16se w16cid w16 w16cex w16sdtdh w16sdtfl w16du wp14">
+  <w:footnote w:type="separator" w:id="-1">
+    <w:p>
+      <w:pPr>
+        <w:spacing w:after="0" w:line="240" w:lineRule="auto"/>
+      </w:pPr>
+      <w:r>
+        <w:separator/>
+      </w:r>
+    </w:p>
+  </w:footnote>
+  <w:footnote w:type="continuationSeparator" w:id="0">
+    <w:p>
+      <w:pPr>
+        <w:spacing w:after="0" w:line="240" w:lineRule="auto"/>
+      </w:pPr>
+      <w:r>
+        <w:continuationSeparator/>
+      </w:r>
+    </w:p>
+  </w:footnote>
+</w:footnotes>
 </file>
 
 <file path=word/numbering.xml><?xml version="1.0" encoding="utf-8"?>
@@ -16361,6 +16468,58 @@
       </w:tblBorders>
     </w:tblPr>
   </w:style>
+  <w:style w:type="paragraph" w:styleId="Header">
+    <w:name w:val="header"/>
+    <w:basedOn w:val="Normal"/>
+    <w:link w:val="HeaderChar"/>
+    <w:uiPriority w:val="99"/>
+    <w:unhideWhenUsed/>
+    <w:rsid w:val="00721A87"/>
+    <w:pPr>
+      <w:tabs>
+        <w:tab w:val="center" w:pos="4680"/>
+        <w:tab w:val="right" w:pos="9360"/>
+      </w:tabs>
+      <w:spacing w:after="0" w:line="240" w:lineRule="auto"/>
+    </w:pPr>
+  </w:style>
+  <w:style w:type="character" w:customStyle="1" w:styleId="HeaderChar">
+    <w:name w:val="Header Char"/>
+    <w:basedOn w:val="DefaultParagraphFont"/>
+    <w:link w:val="Header"/>
+    <w:uiPriority w:val="99"/>
+    <w:rsid w:val="00721A87"/>
+    <w:rPr>
+      <w:noProof/>
+      <w:lang w:val="vi-VN"/>
+    </w:rPr>
+  </w:style>
+  <w:style w:type="paragraph" w:styleId="Footer">
+    <w:name w:val="footer"/>
+    <w:basedOn w:val="Normal"/>
+    <w:link w:val="FooterChar"/>
+    <w:uiPriority w:val="99"/>
+    <w:unhideWhenUsed/>
+    <w:rsid w:val="00721A87"/>
+    <w:pPr>
+      <w:tabs>
+        <w:tab w:val="center" w:pos="4680"/>
+        <w:tab w:val="right" w:pos="9360"/>
+      </w:tabs>
+      <w:spacing w:after="0" w:line="240" w:lineRule="auto"/>
+    </w:pPr>
+  </w:style>
+  <w:style w:type="character" w:customStyle="1" w:styleId="FooterChar">
+    <w:name w:val="Footer Char"/>
+    <w:basedOn w:val="DefaultParagraphFont"/>
+    <w:link w:val="Footer"/>
+    <w:uiPriority w:val="99"/>
+    <w:rsid w:val="00721A87"/>
+    <w:rPr>
+      <w:noProof/>
+      <w:lang w:val="vi-VN"/>
+    </w:rPr>
+  </w:style>
 </w:styles>
 </file>
 

</xml_diff>

<commit_message>
Docs: cập nhật biểu đồ trạng thái
</commit_message>
<xml_diff>
--- a/document/PTTKHT Edudex Quiz.docx
+++ b/document/PTTKHT Edudex Quiz.docx
@@ -11975,29 +11975,1565 @@
         <w:lastRenderedPageBreak/>
         <w:t>2.3 Biểu đồ trạng thái</w:t>
       </w:r>
-    </w:p>
-    <w:p>
-      <w:pPr>
-        <w:rPr>
-          <w:lang w:val="en-US"/>
-        </w:rPr>
-      </w:pPr>
-      <w:r>
-        <w:rPr>
-          <w:lang w:val="en-US"/>
-        </w:rPr>
-        <w:t xml:space="preserve">Phần này trình bày hai biểu đồ trạng thái cho lớp </w:t>
-      </w:r>
-    </w:p>
-    <w:p>
-      <w:pPr>
+      <w:r>
+        <w:rPr>
+          <w:b/>
+          <w:bCs/>
+          <w:lang w:val="en-US"/>
+        </w:rPr>
+        <w:br/>
+      </w:r>
+    </w:p>
+    <w:p>
+      <w:pPr>
+        <w:rPr>
+          <w:lang w:val="en-US"/>
+        </w:rPr>
+      </w:pPr>
+      <w:r>
+        <w:rPr>
+          <w:lang w:val="en-US"/>
+        </w:rPr>
+        <w:drawing>
+          <wp:inline distT="0" distB="0" distL="0" distR="0" wp14:anchorId="635A452A" wp14:editId="296138EE">
+            <wp:extent cx="5760720" cy="3764280"/>
+            <wp:effectExtent l="0" t="0" r="0" b="7620"/>
+            <wp:docPr id="1851807630" name="Picture 22" descr="A diagram of a flowchart&#10;&#10;Description automatically generated"/>
+            <wp:cNvGraphicFramePr>
+              <a:graphicFrameLocks xmlns:a="http://schemas.openxmlformats.org/drawingml/2006/main" noChangeAspect="1"/>
+            </wp:cNvGraphicFramePr>
+            <a:graphic xmlns:a="http://schemas.openxmlformats.org/drawingml/2006/main">
+              <a:graphicData uri="http://schemas.openxmlformats.org/drawingml/2006/picture">
+                <pic:pic xmlns:pic="http://schemas.openxmlformats.org/drawingml/2006/picture">
+                  <pic:nvPicPr>
+                    <pic:cNvPr id="1851807630" name="Picture 22" descr="A diagram of a flowchart&#10;&#10;Description automatically generated"/>
+                    <pic:cNvPicPr/>
+                  </pic:nvPicPr>
+                  <pic:blipFill>
+                    <a:blip r:embed="rId24">
+                      <a:extLst>
+                        <a:ext uri="{28A0092B-C50C-407E-A947-70E740481C1C}">
+                          <a14:useLocalDpi xmlns:a14="http://schemas.microsoft.com/office/drawing/2010/main" val="0"/>
+                        </a:ext>
+                      </a:extLst>
+                    </a:blip>
+                    <a:stretch>
+                      <a:fillRect/>
+                    </a:stretch>
+                  </pic:blipFill>
+                  <pic:spPr>
+                    <a:xfrm>
+                      <a:off x="0" y="0"/>
+                      <a:ext cx="5760720" cy="3764280"/>
+                    </a:xfrm>
+                    <a:prstGeom prst="rect">
+                      <a:avLst/>
+                    </a:prstGeom>
+                  </pic:spPr>
+                </pic:pic>
+              </a:graphicData>
+            </a:graphic>
+          </wp:inline>
+        </w:drawing>
+      </w:r>
+    </w:p>
+    <w:p>
+      <w:pPr>
+        <w:jc w:val="center"/>
+        <w:rPr>
+          <w:lang w:val="en-US"/>
+        </w:rPr>
+      </w:pPr>
+      <w:r>
+        <w:rPr>
+          <w:b/>
+          <w:bCs/>
+          <w:lang w:val="en-US"/>
+        </w:rPr>
+        <w:t>Hình P.</w:t>
+      </w:r>
+      <w:r>
+        <w:rPr>
+          <w:b/>
+          <w:bCs/>
+          <w:lang w:val="en-US"/>
+        </w:rPr>
+        <w:t>1</w:t>
+      </w:r>
+      <w:r>
+        <w:rPr>
+          <w:b/>
+          <w:bCs/>
+          <w:lang w:val="en-US"/>
+        </w:rPr>
+        <w:t>6</w:t>
+      </w:r>
+      <w:r>
+        <w:rPr>
+          <w:b/>
+          <w:bCs/>
+          <w:lang w:val="en-US"/>
+        </w:rPr>
+        <w:t>:</w:t>
+      </w:r>
+      <w:r>
+        <w:rPr>
+          <w:lang w:val="en-US"/>
+        </w:rPr>
+        <w:t xml:space="preserve"> Biểu đồ </w:t>
+      </w:r>
+      <w:r>
+        <w:rPr>
+          <w:lang w:val="en-US"/>
+        </w:rPr>
+        <w:t>trạng thái lớp đăng nhập</w:t>
+      </w:r>
+    </w:p>
+    <w:p>
+      <w:pPr>
+        <w:jc w:val="center"/>
+        <w:rPr>
+          <w:lang w:val="en-US"/>
+        </w:rPr>
+      </w:pPr>
+    </w:p>
+    <w:p>
+      <w:pPr>
+        <w:rPr>
+          <w:lang w:val="en-US"/>
+        </w:rPr>
+      </w:pPr>
+      <w:r>
+        <w:rPr>
+          <w:lang w:val="en-US"/>
+        </w:rPr>
+        <w:drawing>
+          <wp:inline distT="0" distB="0" distL="0" distR="0" wp14:anchorId="692E0D1B" wp14:editId="634E65CA">
+            <wp:extent cx="5760720" cy="2774950"/>
+            <wp:effectExtent l="0" t="0" r="0" b="6350"/>
+            <wp:docPr id="476904538" name="Picture 18" descr="A screenshot of a computer&#10;&#10;Description automatically generated"/>
+            <wp:cNvGraphicFramePr>
+              <a:graphicFrameLocks xmlns:a="http://schemas.openxmlformats.org/drawingml/2006/main" noChangeAspect="1"/>
+            </wp:cNvGraphicFramePr>
+            <a:graphic xmlns:a="http://schemas.openxmlformats.org/drawingml/2006/main">
+              <a:graphicData uri="http://schemas.openxmlformats.org/drawingml/2006/picture">
+                <pic:pic xmlns:pic="http://schemas.openxmlformats.org/drawingml/2006/picture">
+                  <pic:nvPicPr>
+                    <pic:cNvPr id="476904538" name="Picture 18" descr="A screenshot of a computer&#10;&#10;Description automatically generated"/>
+                    <pic:cNvPicPr/>
+                  </pic:nvPicPr>
+                  <pic:blipFill>
+                    <a:blip r:embed="rId25" cstate="print">
+                      <a:extLst>
+                        <a:ext uri="{28A0092B-C50C-407E-A947-70E740481C1C}">
+                          <a14:useLocalDpi xmlns:a14="http://schemas.microsoft.com/office/drawing/2010/main" val="0"/>
+                        </a:ext>
+                      </a:extLst>
+                    </a:blip>
+                    <a:stretch>
+                      <a:fillRect/>
+                    </a:stretch>
+                  </pic:blipFill>
+                  <pic:spPr>
+                    <a:xfrm>
+                      <a:off x="0" y="0"/>
+                      <a:ext cx="5760720" cy="2774950"/>
+                    </a:xfrm>
+                    <a:prstGeom prst="rect">
+                      <a:avLst/>
+                    </a:prstGeom>
+                  </pic:spPr>
+                </pic:pic>
+              </a:graphicData>
+            </a:graphic>
+          </wp:inline>
+        </w:drawing>
+      </w:r>
+    </w:p>
+    <w:p>
+      <w:pPr>
+        <w:jc w:val="center"/>
+        <w:rPr>
+          <w:lang w:val="en-US"/>
+        </w:rPr>
+      </w:pPr>
+      <w:r>
+        <w:rPr>
+          <w:b/>
+          <w:bCs/>
+          <w:lang w:val="en-US"/>
+        </w:rPr>
+        <w:t>Hình P.</w:t>
+      </w:r>
+      <w:r>
+        <w:rPr>
+          <w:b/>
+          <w:bCs/>
+          <w:lang w:val="en-US"/>
+        </w:rPr>
+        <w:t>1</w:t>
+      </w:r>
+      <w:r>
+        <w:rPr>
+          <w:b/>
+          <w:bCs/>
+          <w:lang w:val="en-US"/>
+        </w:rPr>
+        <w:t>7</w:t>
+      </w:r>
+      <w:r>
+        <w:rPr>
+          <w:b/>
+          <w:bCs/>
+          <w:lang w:val="en-US"/>
+        </w:rPr>
+        <w:t>:</w:t>
+      </w:r>
+      <w:r>
+        <w:rPr>
+          <w:lang w:val="en-US"/>
+        </w:rPr>
+        <w:t xml:space="preserve"> Biểu đồ </w:t>
+      </w:r>
+      <w:r>
+        <w:rPr>
+          <w:lang w:val="en-US"/>
+        </w:rPr>
+        <w:t xml:space="preserve">trạng thái lớp </w:t>
+      </w:r>
+      <w:r>
+        <w:rPr>
+          <w:lang w:val="en-US"/>
+        </w:rPr>
+        <w:t>phòng</w:t>
+      </w:r>
+      <w:r>
+        <w:rPr>
+          <w:lang w:val="en-US"/>
+        </w:rPr>
+        <w:t xml:space="preserve"> thi</w:t>
+      </w:r>
+    </w:p>
+    <w:p>
+      <w:pPr>
+        <w:jc w:val="center"/>
+        <w:rPr>
+          <w:lang w:val="en-US"/>
+        </w:rPr>
+      </w:pPr>
+      <w:r>
+        <w:rPr>
+          <w:lang w:val="en-US"/>
+        </w:rPr>
+        <w:lastRenderedPageBreak/>
+        <w:drawing>
+          <wp:inline distT="0" distB="0" distL="0" distR="0" wp14:anchorId="3E9EB392" wp14:editId="5E9DB5A5">
+            <wp:extent cx="5760720" cy="2774950"/>
+            <wp:effectExtent l="0" t="0" r="0" b="6350"/>
+            <wp:docPr id="1516355147" name="Picture 7" descr="A screenshot of a computer flowchart&#10;&#10;Description automatically generated"/>
+            <wp:cNvGraphicFramePr>
+              <a:graphicFrameLocks xmlns:a="http://schemas.openxmlformats.org/drawingml/2006/main" noChangeAspect="1"/>
+            </wp:cNvGraphicFramePr>
+            <a:graphic xmlns:a="http://schemas.openxmlformats.org/drawingml/2006/main">
+              <a:graphicData uri="http://schemas.openxmlformats.org/drawingml/2006/picture">
+                <pic:pic xmlns:pic="http://schemas.openxmlformats.org/drawingml/2006/picture">
+                  <pic:nvPicPr>
+                    <pic:cNvPr id="1516355147" name="Picture 7" descr="A screenshot of a computer flowchart&#10;&#10;Description automatically generated"/>
+                    <pic:cNvPicPr/>
+                  </pic:nvPicPr>
+                  <pic:blipFill>
+                    <a:blip r:embed="rId26" cstate="print">
+                      <a:extLst>
+                        <a:ext uri="{28A0092B-C50C-407E-A947-70E740481C1C}">
+                          <a14:useLocalDpi xmlns:a14="http://schemas.microsoft.com/office/drawing/2010/main" val="0"/>
+                        </a:ext>
+                      </a:extLst>
+                    </a:blip>
+                    <a:stretch>
+                      <a:fillRect/>
+                    </a:stretch>
+                  </pic:blipFill>
+                  <pic:spPr>
+                    <a:xfrm>
+                      <a:off x="0" y="0"/>
+                      <a:ext cx="5760720" cy="2774950"/>
+                    </a:xfrm>
+                    <a:prstGeom prst="rect">
+                      <a:avLst/>
+                    </a:prstGeom>
+                  </pic:spPr>
+                </pic:pic>
+              </a:graphicData>
+            </a:graphic>
+          </wp:inline>
+        </w:drawing>
+      </w:r>
+    </w:p>
+    <w:p>
+      <w:pPr>
+        <w:jc w:val="center"/>
+        <w:rPr>
+          <w:lang w:val="en-US"/>
+        </w:rPr>
+      </w:pPr>
+      <w:r>
+        <w:rPr>
+          <w:b/>
+          <w:bCs/>
+          <w:lang w:val="en-US"/>
+        </w:rPr>
+        <w:t>Hình P.</w:t>
+      </w:r>
+      <w:r>
+        <w:rPr>
+          <w:b/>
+          <w:bCs/>
+          <w:lang w:val="en-US"/>
+        </w:rPr>
+        <w:t>1</w:t>
+      </w:r>
+      <w:r>
+        <w:rPr>
+          <w:b/>
+          <w:bCs/>
+          <w:lang w:val="en-US"/>
+        </w:rPr>
+        <w:t>8</w:t>
+      </w:r>
+      <w:r>
+        <w:rPr>
+          <w:b/>
+          <w:bCs/>
+          <w:lang w:val="en-US"/>
+        </w:rPr>
+        <w:t>:</w:t>
+      </w:r>
+      <w:r>
+        <w:rPr>
+          <w:lang w:val="en-US"/>
+        </w:rPr>
+        <w:t xml:space="preserve"> Biểu đồ </w:t>
+      </w:r>
+      <w:r>
+        <w:rPr>
+          <w:lang w:val="en-US"/>
+        </w:rPr>
+        <w:t>trạng thái lớp đề thi</w:t>
+      </w:r>
+    </w:p>
+    <w:p>
+      <w:pPr>
+        <w:jc w:val="center"/>
+        <w:rPr>
+          <w:lang w:val="en-US"/>
+        </w:rPr>
+      </w:pPr>
+      <w:r>
+        <w:rPr>
+          <w:lang w:val="en-US"/>
+        </w:rPr>
+        <w:drawing>
+          <wp:inline distT="0" distB="0" distL="0" distR="0" wp14:anchorId="038C44CD" wp14:editId="13E5C68F">
+            <wp:extent cx="5760720" cy="2774950"/>
+            <wp:effectExtent l="0" t="0" r="0" b="6350"/>
+            <wp:docPr id="1538039758" name="Picture 8" descr="A screenshot of a computer flowchart&#10;&#10;Description automatically generated"/>
+            <wp:cNvGraphicFramePr>
+              <a:graphicFrameLocks xmlns:a="http://schemas.openxmlformats.org/drawingml/2006/main" noChangeAspect="1"/>
+            </wp:cNvGraphicFramePr>
+            <a:graphic xmlns:a="http://schemas.openxmlformats.org/drawingml/2006/main">
+              <a:graphicData uri="http://schemas.openxmlformats.org/drawingml/2006/picture">
+                <pic:pic xmlns:pic="http://schemas.openxmlformats.org/drawingml/2006/picture">
+                  <pic:nvPicPr>
+                    <pic:cNvPr id="1538039758" name="Picture 8" descr="A screenshot of a computer flowchart&#10;&#10;Description automatically generated"/>
+                    <pic:cNvPicPr/>
+                  </pic:nvPicPr>
+                  <pic:blipFill>
+                    <a:blip r:embed="rId27" cstate="print">
+                      <a:extLst>
+                        <a:ext uri="{28A0092B-C50C-407E-A947-70E740481C1C}">
+                          <a14:useLocalDpi xmlns:a14="http://schemas.microsoft.com/office/drawing/2010/main" val="0"/>
+                        </a:ext>
+                      </a:extLst>
+                    </a:blip>
+                    <a:stretch>
+                      <a:fillRect/>
+                    </a:stretch>
+                  </pic:blipFill>
+                  <pic:spPr>
+                    <a:xfrm>
+                      <a:off x="0" y="0"/>
+                      <a:ext cx="5760720" cy="2774950"/>
+                    </a:xfrm>
+                    <a:prstGeom prst="rect">
+                      <a:avLst/>
+                    </a:prstGeom>
+                  </pic:spPr>
+                </pic:pic>
+              </a:graphicData>
+            </a:graphic>
+          </wp:inline>
+        </w:drawing>
+      </w:r>
+    </w:p>
+    <w:p>
+      <w:pPr>
+        <w:jc w:val="center"/>
+        <w:rPr>
+          <w:lang w:val="en-US"/>
+        </w:rPr>
+      </w:pPr>
+      <w:r>
+        <w:rPr>
+          <w:b/>
+          <w:bCs/>
+          <w:lang w:val="en-US"/>
+        </w:rPr>
+        <w:t>Hình P.</w:t>
+      </w:r>
+      <w:r>
+        <w:rPr>
+          <w:b/>
+          <w:bCs/>
+          <w:lang w:val="en-US"/>
+        </w:rPr>
+        <w:t>1</w:t>
+      </w:r>
+      <w:r>
+        <w:rPr>
+          <w:b/>
+          <w:bCs/>
+          <w:lang w:val="en-US"/>
+        </w:rPr>
+        <w:t>9</w:t>
+      </w:r>
+      <w:r>
+        <w:rPr>
+          <w:b/>
+          <w:bCs/>
+          <w:lang w:val="en-US"/>
+        </w:rPr>
+        <w:t>:</w:t>
+      </w:r>
+      <w:r>
+        <w:rPr>
+          <w:lang w:val="en-US"/>
+        </w:rPr>
+        <w:t xml:space="preserve"> Biểu đồ </w:t>
+      </w:r>
+      <w:r>
+        <w:rPr>
+          <w:lang w:val="en-US"/>
+        </w:rPr>
+        <w:t xml:space="preserve">trạng thái lớp </w:t>
+      </w:r>
+      <w:r>
+        <w:rPr>
+          <w:lang w:val="en-US"/>
+        </w:rPr>
+        <w:t>tài khoản</w:t>
+      </w:r>
+    </w:p>
+    <w:p>
+      <w:pPr>
+        <w:jc w:val="center"/>
+        <w:rPr>
+          <w:lang w:val="en-US"/>
+        </w:rPr>
+      </w:pPr>
+      <w:r>
+        <w:rPr>
+          <w:lang w:val="en-US"/>
+        </w:rPr>
+        <w:lastRenderedPageBreak/>
+        <w:drawing>
+          <wp:inline distT="0" distB="0" distL="0" distR="0" wp14:anchorId="3650E96D" wp14:editId="2D758384">
+            <wp:extent cx="5760720" cy="2774950"/>
+            <wp:effectExtent l="0" t="0" r="0" b="6350"/>
+            <wp:docPr id="1996416981" name="Picture 14" descr="A screenshot of a computer&#10;&#10;Description automatically generated"/>
+            <wp:cNvGraphicFramePr>
+              <a:graphicFrameLocks xmlns:a="http://schemas.openxmlformats.org/drawingml/2006/main" noChangeAspect="1"/>
+            </wp:cNvGraphicFramePr>
+            <a:graphic xmlns:a="http://schemas.openxmlformats.org/drawingml/2006/main">
+              <a:graphicData uri="http://schemas.openxmlformats.org/drawingml/2006/picture">
+                <pic:pic xmlns:pic="http://schemas.openxmlformats.org/drawingml/2006/picture">
+                  <pic:nvPicPr>
+                    <pic:cNvPr id="1996416981" name="Picture 14" descr="A screenshot of a computer&#10;&#10;Description automatically generated"/>
+                    <pic:cNvPicPr/>
+                  </pic:nvPicPr>
+                  <pic:blipFill>
+                    <a:blip r:embed="rId28" cstate="print">
+                      <a:extLst>
+                        <a:ext uri="{28A0092B-C50C-407E-A947-70E740481C1C}">
+                          <a14:useLocalDpi xmlns:a14="http://schemas.microsoft.com/office/drawing/2010/main" val="0"/>
+                        </a:ext>
+                      </a:extLst>
+                    </a:blip>
+                    <a:stretch>
+                      <a:fillRect/>
+                    </a:stretch>
+                  </pic:blipFill>
+                  <pic:spPr>
+                    <a:xfrm>
+                      <a:off x="0" y="0"/>
+                      <a:ext cx="5760720" cy="2774950"/>
+                    </a:xfrm>
+                    <a:prstGeom prst="rect">
+                      <a:avLst/>
+                    </a:prstGeom>
+                  </pic:spPr>
+                </pic:pic>
+              </a:graphicData>
+            </a:graphic>
+          </wp:inline>
+        </w:drawing>
+      </w:r>
+    </w:p>
+    <w:p>
+      <w:pPr>
+        <w:jc w:val="center"/>
+        <w:rPr>
+          <w:lang w:val="en-US"/>
+        </w:rPr>
+      </w:pPr>
+      <w:r>
+        <w:rPr>
+          <w:b/>
+          <w:bCs/>
+          <w:lang w:val="en-US"/>
+        </w:rPr>
+        <w:t>Hình P.</w:t>
+      </w:r>
+      <w:r>
+        <w:rPr>
+          <w:b/>
+          <w:bCs/>
+          <w:lang w:val="en-US"/>
+        </w:rPr>
+        <w:t>20</w:t>
+      </w:r>
+      <w:r>
+        <w:rPr>
+          <w:b/>
+          <w:bCs/>
+          <w:lang w:val="en-US"/>
+        </w:rPr>
+        <w:t>:</w:t>
+      </w:r>
+      <w:r>
+        <w:rPr>
+          <w:lang w:val="en-US"/>
+        </w:rPr>
+        <w:t xml:space="preserve"> Biểu đồ </w:t>
+      </w:r>
+      <w:r>
+        <w:rPr>
+          <w:lang w:val="en-US"/>
+        </w:rPr>
+        <w:t xml:space="preserve">trạng thái lớp </w:t>
+      </w:r>
+      <w:r>
+        <w:rPr>
+          <w:lang w:val="en-US"/>
+        </w:rPr>
+        <w:t>ngân hàng câu hỏi</w:t>
+      </w:r>
+    </w:p>
+    <w:p>
+      <w:pPr>
+        <w:jc w:val="center"/>
+        <w:rPr>
+          <w:lang w:val="en-US"/>
+        </w:rPr>
+      </w:pPr>
+    </w:p>
+    <w:p>
+      <w:pPr>
+        <w:rPr>
+          <w:lang w:val="en-US"/>
+        </w:rPr>
+      </w:pPr>
+      <w:r>
+        <w:rPr>
+          <w:lang w:val="en-US"/>
+        </w:rPr>
+        <w:drawing>
+          <wp:inline distT="0" distB="0" distL="0" distR="0" wp14:anchorId="332B958E" wp14:editId="0415D227">
+            <wp:extent cx="5760720" cy="2774950"/>
+            <wp:effectExtent l="0" t="0" r="0" b="6350"/>
+            <wp:docPr id="864988708" name="Picture 10" descr="A screenshot of a computer flowchart&#10;&#10;Description automatically generated"/>
+            <wp:cNvGraphicFramePr>
+              <a:graphicFrameLocks xmlns:a="http://schemas.openxmlformats.org/drawingml/2006/main" noChangeAspect="1"/>
+            </wp:cNvGraphicFramePr>
+            <a:graphic xmlns:a="http://schemas.openxmlformats.org/drawingml/2006/main">
+              <a:graphicData uri="http://schemas.openxmlformats.org/drawingml/2006/picture">
+                <pic:pic xmlns:pic="http://schemas.openxmlformats.org/drawingml/2006/picture">
+                  <pic:nvPicPr>
+                    <pic:cNvPr id="864988708" name="Picture 10" descr="A screenshot of a computer flowchart&#10;&#10;Description automatically generated"/>
+                    <pic:cNvPicPr/>
+                  </pic:nvPicPr>
+                  <pic:blipFill>
+                    <a:blip r:embed="rId29" cstate="print">
+                      <a:extLst>
+                        <a:ext uri="{28A0092B-C50C-407E-A947-70E740481C1C}">
+                          <a14:useLocalDpi xmlns:a14="http://schemas.microsoft.com/office/drawing/2010/main" val="0"/>
+                        </a:ext>
+                      </a:extLst>
+                    </a:blip>
+                    <a:stretch>
+                      <a:fillRect/>
+                    </a:stretch>
+                  </pic:blipFill>
+                  <pic:spPr>
+                    <a:xfrm>
+                      <a:off x="0" y="0"/>
+                      <a:ext cx="5760720" cy="2774950"/>
+                    </a:xfrm>
+                    <a:prstGeom prst="rect">
+                      <a:avLst/>
+                    </a:prstGeom>
+                  </pic:spPr>
+                </pic:pic>
+              </a:graphicData>
+            </a:graphic>
+          </wp:inline>
+        </w:drawing>
+      </w:r>
+    </w:p>
+    <w:p>
+      <w:pPr>
+        <w:jc w:val="center"/>
+        <w:rPr>
+          <w:lang w:val="en-US"/>
+        </w:rPr>
+      </w:pPr>
+      <w:r>
+        <w:rPr>
+          <w:b/>
+          <w:bCs/>
+          <w:lang w:val="en-US"/>
+        </w:rPr>
+        <w:t>Hình P.</w:t>
+      </w:r>
+      <w:r>
+        <w:rPr>
+          <w:b/>
+          <w:bCs/>
+          <w:lang w:val="en-US"/>
+        </w:rPr>
+        <w:t>21</w:t>
+      </w:r>
+      <w:r>
+        <w:rPr>
+          <w:b/>
+          <w:bCs/>
+          <w:lang w:val="en-US"/>
+        </w:rPr>
+        <w:t>:</w:t>
+      </w:r>
+      <w:r>
+        <w:rPr>
+          <w:lang w:val="en-US"/>
+        </w:rPr>
+        <w:t xml:space="preserve"> Biểu đồ </w:t>
+      </w:r>
+      <w:r>
+        <w:rPr>
+          <w:lang w:val="en-US"/>
+        </w:rPr>
+        <w:t xml:space="preserve">trạng thái lớp </w:t>
+      </w:r>
+      <w:r>
+        <w:rPr>
+          <w:lang w:val="en-US"/>
+        </w:rPr>
+        <w:t>kỳ thi</w:t>
+      </w:r>
+    </w:p>
+    <w:p>
+      <w:pPr>
+        <w:jc w:val="center"/>
+        <w:rPr>
+          <w:lang w:val="en-US"/>
+        </w:rPr>
+      </w:pPr>
+      <w:r>
+        <w:rPr>
+          <w:lang w:val="en-US"/>
+        </w:rPr>
+        <w:lastRenderedPageBreak/>
+        <w:drawing>
+          <wp:inline distT="0" distB="0" distL="0" distR="0" wp14:anchorId="52312D54" wp14:editId="23B51F92">
+            <wp:extent cx="5760720" cy="2774950"/>
+            <wp:effectExtent l="0" t="0" r="0" b="6350"/>
+            <wp:docPr id="1567351532" name="Picture 19" descr="A screenshot of a computer&#10;&#10;Description automatically generated"/>
+            <wp:cNvGraphicFramePr>
+              <a:graphicFrameLocks xmlns:a="http://schemas.openxmlformats.org/drawingml/2006/main" noChangeAspect="1"/>
+            </wp:cNvGraphicFramePr>
+            <a:graphic xmlns:a="http://schemas.openxmlformats.org/drawingml/2006/main">
+              <a:graphicData uri="http://schemas.openxmlformats.org/drawingml/2006/picture">
+                <pic:pic xmlns:pic="http://schemas.openxmlformats.org/drawingml/2006/picture">
+                  <pic:nvPicPr>
+                    <pic:cNvPr id="1567351532" name="Picture 19" descr="A screenshot of a computer&#10;&#10;Description automatically generated"/>
+                    <pic:cNvPicPr/>
+                  </pic:nvPicPr>
+                  <pic:blipFill>
+                    <a:blip r:embed="rId30" cstate="print">
+                      <a:extLst>
+                        <a:ext uri="{28A0092B-C50C-407E-A947-70E740481C1C}">
+                          <a14:useLocalDpi xmlns:a14="http://schemas.microsoft.com/office/drawing/2010/main" val="0"/>
+                        </a:ext>
+                      </a:extLst>
+                    </a:blip>
+                    <a:stretch>
+                      <a:fillRect/>
+                    </a:stretch>
+                  </pic:blipFill>
+                  <pic:spPr>
+                    <a:xfrm>
+                      <a:off x="0" y="0"/>
+                      <a:ext cx="5760720" cy="2774950"/>
+                    </a:xfrm>
+                    <a:prstGeom prst="rect">
+                      <a:avLst/>
+                    </a:prstGeom>
+                  </pic:spPr>
+                </pic:pic>
+              </a:graphicData>
+            </a:graphic>
+          </wp:inline>
+        </w:drawing>
+      </w:r>
+    </w:p>
+    <w:p>
+      <w:pPr>
+        <w:jc w:val="center"/>
+        <w:rPr>
+          <w:lang w:val="en-US"/>
+        </w:rPr>
+      </w:pPr>
+      <w:r>
+        <w:rPr>
+          <w:b/>
+          <w:bCs/>
+          <w:lang w:val="en-US"/>
+        </w:rPr>
+        <w:t>Hình P.</w:t>
+      </w:r>
+      <w:r>
+        <w:rPr>
+          <w:b/>
+          <w:bCs/>
+          <w:lang w:val="en-US"/>
+        </w:rPr>
+        <w:t>2</w:t>
+      </w:r>
+      <w:r>
+        <w:rPr>
+          <w:b/>
+          <w:bCs/>
+          <w:lang w:val="en-US"/>
+        </w:rPr>
+        <w:t>2</w:t>
+      </w:r>
+      <w:r>
+        <w:rPr>
+          <w:b/>
+          <w:bCs/>
+          <w:lang w:val="en-US"/>
+        </w:rPr>
+        <w:t>:</w:t>
+      </w:r>
+      <w:r>
+        <w:rPr>
+          <w:lang w:val="en-US"/>
+        </w:rPr>
+        <w:t xml:space="preserve"> Biểu đồ </w:t>
+      </w:r>
+      <w:r>
+        <w:rPr>
+          <w:lang w:val="en-US"/>
+        </w:rPr>
+        <w:t xml:space="preserve">trạng thái lớp </w:t>
+      </w:r>
+      <w:r>
+        <w:rPr>
+          <w:lang w:val="en-US"/>
+        </w:rPr>
+        <w:t>ca</w:t>
+      </w:r>
+      <w:r>
+        <w:rPr>
+          <w:lang w:val="en-US"/>
+        </w:rPr>
+        <w:t xml:space="preserve"> thi</w:t>
+      </w:r>
+    </w:p>
+    <w:p>
+      <w:pPr>
+        <w:jc w:val="center"/>
+        <w:rPr>
+          <w:lang w:val="en-US"/>
+        </w:rPr>
+      </w:pPr>
+      <w:r>
+        <w:rPr>
+          <w:lang w:val="en-US"/>
+        </w:rPr>
+        <w:drawing>
+          <wp:inline distT="0" distB="0" distL="0" distR="0" wp14:anchorId="74E1D35E" wp14:editId="7D6619D7">
+            <wp:extent cx="5760720" cy="4648200"/>
+            <wp:effectExtent l="0" t="0" r="0" b="0"/>
+            <wp:docPr id="1438832788" name="Picture 15" descr="A diagram of a flowchart&#10;&#10;Description automatically generated"/>
+            <wp:cNvGraphicFramePr>
+              <a:graphicFrameLocks xmlns:a="http://schemas.openxmlformats.org/drawingml/2006/main" noChangeAspect="1"/>
+            </wp:cNvGraphicFramePr>
+            <a:graphic xmlns:a="http://schemas.openxmlformats.org/drawingml/2006/main">
+              <a:graphicData uri="http://schemas.openxmlformats.org/drawingml/2006/picture">
+                <pic:pic xmlns:pic="http://schemas.openxmlformats.org/drawingml/2006/picture">
+                  <pic:nvPicPr>
+                    <pic:cNvPr id="1438832788" name="Picture 15" descr="A diagram of a flowchart&#10;&#10;Description automatically generated"/>
+                    <pic:cNvPicPr/>
+                  </pic:nvPicPr>
+                  <pic:blipFill>
+                    <a:blip r:embed="rId31">
+                      <a:extLst>
+                        <a:ext uri="{28A0092B-C50C-407E-A947-70E740481C1C}">
+                          <a14:useLocalDpi xmlns:a14="http://schemas.microsoft.com/office/drawing/2010/main" val="0"/>
+                        </a:ext>
+                      </a:extLst>
+                    </a:blip>
+                    <a:stretch>
+                      <a:fillRect/>
+                    </a:stretch>
+                  </pic:blipFill>
+                  <pic:spPr>
+                    <a:xfrm>
+                      <a:off x="0" y="0"/>
+                      <a:ext cx="5760720" cy="4648200"/>
+                    </a:xfrm>
+                    <a:prstGeom prst="rect">
+                      <a:avLst/>
+                    </a:prstGeom>
+                  </pic:spPr>
+                </pic:pic>
+              </a:graphicData>
+            </a:graphic>
+          </wp:inline>
+        </w:drawing>
+      </w:r>
+    </w:p>
+    <w:p>
+      <w:pPr>
+        <w:jc w:val="center"/>
+        <w:rPr>
+          <w:lang w:val="en-US"/>
+        </w:rPr>
+      </w:pPr>
+      <w:r>
+        <w:rPr>
+          <w:b/>
+          <w:bCs/>
+          <w:lang w:val="en-US"/>
+        </w:rPr>
+        <w:t>Hình P.</w:t>
+      </w:r>
+      <w:r>
+        <w:rPr>
+          <w:b/>
+          <w:bCs/>
+          <w:lang w:val="en-US"/>
+        </w:rPr>
+        <w:t>2</w:t>
+      </w:r>
+      <w:r>
+        <w:rPr>
+          <w:b/>
+          <w:bCs/>
+          <w:lang w:val="en-US"/>
+        </w:rPr>
+        <w:t>3</w:t>
+      </w:r>
+      <w:r>
+        <w:rPr>
+          <w:b/>
+          <w:bCs/>
+          <w:lang w:val="en-US"/>
+        </w:rPr>
+        <w:t>:</w:t>
+      </w:r>
+      <w:r>
+        <w:rPr>
+          <w:lang w:val="en-US"/>
+        </w:rPr>
+        <w:t xml:space="preserve"> Biểu đồ </w:t>
+      </w:r>
+      <w:r>
+        <w:rPr>
+          <w:lang w:val="en-US"/>
+        </w:rPr>
+        <w:t xml:space="preserve">trạng thái lớp </w:t>
+      </w:r>
+      <w:r>
+        <w:rPr>
+          <w:lang w:val="en-US"/>
+        </w:rPr>
+        <w:t>bài làm</w:t>
+      </w:r>
+    </w:p>
+    <w:p>
+      <w:pPr>
+        <w:jc w:val="center"/>
+        <w:rPr>
+          <w:lang w:val="en-US"/>
+        </w:rPr>
+      </w:pPr>
+      <w:r>
+        <w:rPr>
+          <w:lang w:val="en-US"/>
+        </w:rPr>
+        <w:lastRenderedPageBreak/>
+        <w:drawing>
+          <wp:inline distT="0" distB="0" distL="0" distR="0" wp14:anchorId="298B7819" wp14:editId="69C0E9D2">
+            <wp:extent cx="5760720" cy="2774950"/>
+            <wp:effectExtent l="0" t="0" r="0" b="6350"/>
+            <wp:docPr id="1301325328" name="Picture 20" descr="A screenshot of a computer&#10;&#10;Description automatically generated"/>
+            <wp:cNvGraphicFramePr>
+              <a:graphicFrameLocks xmlns:a="http://schemas.openxmlformats.org/drawingml/2006/main" noChangeAspect="1"/>
+            </wp:cNvGraphicFramePr>
+            <a:graphic xmlns:a="http://schemas.openxmlformats.org/drawingml/2006/main">
+              <a:graphicData uri="http://schemas.openxmlformats.org/drawingml/2006/picture">
+                <pic:pic xmlns:pic="http://schemas.openxmlformats.org/drawingml/2006/picture">
+                  <pic:nvPicPr>
+                    <pic:cNvPr id="1301325328" name="Picture 20" descr="A screenshot of a computer&#10;&#10;Description automatically generated"/>
+                    <pic:cNvPicPr/>
+                  </pic:nvPicPr>
+                  <pic:blipFill>
+                    <a:blip r:embed="rId32" cstate="print">
+                      <a:extLst>
+                        <a:ext uri="{28A0092B-C50C-407E-A947-70E740481C1C}">
+                          <a14:useLocalDpi xmlns:a14="http://schemas.microsoft.com/office/drawing/2010/main" val="0"/>
+                        </a:ext>
+                      </a:extLst>
+                    </a:blip>
+                    <a:stretch>
+                      <a:fillRect/>
+                    </a:stretch>
+                  </pic:blipFill>
+                  <pic:spPr>
+                    <a:xfrm>
+                      <a:off x="0" y="0"/>
+                      <a:ext cx="5760720" cy="2774950"/>
+                    </a:xfrm>
+                    <a:prstGeom prst="rect">
+                      <a:avLst/>
+                    </a:prstGeom>
+                  </pic:spPr>
+                </pic:pic>
+              </a:graphicData>
+            </a:graphic>
+          </wp:inline>
+        </w:drawing>
+      </w:r>
+    </w:p>
+    <w:p>
+      <w:pPr>
+        <w:jc w:val="center"/>
+        <w:rPr>
+          <w:lang w:val="en-US"/>
+        </w:rPr>
+      </w:pPr>
+      <w:r>
+        <w:rPr>
+          <w:b/>
+          <w:bCs/>
+          <w:lang w:val="en-US"/>
+        </w:rPr>
+        <w:t>Hình P.</w:t>
+      </w:r>
+      <w:r>
+        <w:rPr>
+          <w:b/>
+          <w:bCs/>
+          <w:lang w:val="en-US"/>
+        </w:rPr>
+        <w:t>2</w:t>
+      </w:r>
+      <w:r>
+        <w:rPr>
+          <w:b/>
+          <w:bCs/>
+          <w:lang w:val="en-US"/>
+        </w:rPr>
+        <w:t>4</w:t>
+      </w:r>
+      <w:r>
+        <w:rPr>
+          <w:b/>
+          <w:bCs/>
+          <w:lang w:val="en-US"/>
+        </w:rPr>
+        <w:t>:</w:t>
+      </w:r>
+      <w:r>
+        <w:rPr>
+          <w:lang w:val="en-US"/>
+        </w:rPr>
+        <w:t xml:space="preserve"> Biểu đồ </w:t>
+      </w:r>
+      <w:r>
+        <w:rPr>
+          <w:lang w:val="en-US"/>
+        </w:rPr>
+        <w:t xml:space="preserve">trạng thái lớp </w:t>
+      </w:r>
+      <w:r>
+        <w:rPr>
+          <w:lang w:val="en-US"/>
+        </w:rPr>
+        <w:t>thí sinh</w:t>
+      </w:r>
+    </w:p>
+    <w:p>
+      <w:pPr>
+        <w:jc w:val="center"/>
+        <w:rPr>
+          <w:lang w:val="en-US"/>
+        </w:rPr>
+      </w:pPr>
+      <w:r>
+        <w:rPr>
+          <w:lang w:val="en-US"/>
+        </w:rPr>
+        <w:drawing>
+          <wp:inline distT="0" distB="0" distL="0" distR="0" wp14:anchorId="79BFB127" wp14:editId="36AC580F">
+            <wp:extent cx="4486275" cy="4219575"/>
+            <wp:effectExtent l="0" t="0" r="9525" b="9525"/>
+            <wp:docPr id="1595046593" name="Picture 21" descr="A diagram of a flowchart&#10;&#10;Description automatically generated"/>
+            <wp:cNvGraphicFramePr>
+              <a:graphicFrameLocks xmlns:a="http://schemas.openxmlformats.org/drawingml/2006/main" noChangeAspect="1"/>
+            </wp:cNvGraphicFramePr>
+            <a:graphic xmlns:a="http://schemas.openxmlformats.org/drawingml/2006/main">
+              <a:graphicData uri="http://schemas.openxmlformats.org/drawingml/2006/picture">
+                <pic:pic xmlns:pic="http://schemas.openxmlformats.org/drawingml/2006/picture">
+                  <pic:nvPicPr>
+                    <pic:cNvPr id="1595046593" name="Picture 21" descr="A diagram of a flowchart&#10;&#10;Description automatically generated"/>
+                    <pic:cNvPicPr/>
+                  </pic:nvPicPr>
+                  <pic:blipFill>
+                    <a:blip r:embed="rId33">
+                      <a:extLst>
+                        <a:ext uri="{28A0092B-C50C-407E-A947-70E740481C1C}">
+                          <a14:useLocalDpi xmlns:a14="http://schemas.microsoft.com/office/drawing/2010/main" val="0"/>
+                        </a:ext>
+                      </a:extLst>
+                    </a:blip>
+                    <a:stretch>
+                      <a:fillRect/>
+                    </a:stretch>
+                  </pic:blipFill>
+                  <pic:spPr>
+                    <a:xfrm>
+                      <a:off x="0" y="0"/>
+                      <a:ext cx="4486275" cy="4219575"/>
+                    </a:xfrm>
+                    <a:prstGeom prst="rect">
+                      <a:avLst/>
+                    </a:prstGeom>
+                  </pic:spPr>
+                </pic:pic>
+              </a:graphicData>
+            </a:graphic>
+          </wp:inline>
+        </w:drawing>
+      </w:r>
+    </w:p>
+    <w:p>
+      <w:pPr>
+        <w:jc w:val="center"/>
+        <w:rPr>
+          <w:lang w:val="en-US"/>
+        </w:rPr>
+      </w:pPr>
+      <w:r>
+        <w:rPr>
+          <w:b/>
+          <w:bCs/>
+          <w:lang w:val="en-US"/>
+        </w:rPr>
+        <w:t>Hình P.</w:t>
+      </w:r>
+      <w:r>
+        <w:rPr>
+          <w:b/>
+          <w:bCs/>
+          <w:lang w:val="en-US"/>
+        </w:rPr>
+        <w:t>2</w:t>
+      </w:r>
+      <w:r>
+        <w:rPr>
+          <w:b/>
+          <w:bCs/>
+          <w:lang w:val="en-US"/>
+        </w:rPr>
+        <w:t>5</w:t>
+      </w:r>
+      <w:r>
+        <w:rPr>
+          <w:b/>
+          <w:bCs/>
+          <w:lang w:val="en-US"/>
+        </w:rPr>
+        <w:t>:</w:t>
+      </w:r>
+      <w:r>
+        <w:rPr>
+          <w:lang w:val="en-US"/>
+        </w:rPr>
+        <w:t xml:space="preserve"> Biểu đồ </w:t>
+      </w:r>
+      <w:r>
+        <w:rPr>
+          <w:lang w:val="en-US"/>
+        </w:rPr>
+        <w:t xml:space="preserve">trạng thái lớp </w:t>
+      </w:r>
+      <w:r>
+        <w:rPr>
+          <w:lang w:val="en-US"/>
+        </w:rPr>
+        <w:t>kiểm tra thông tin</w:t>
+      </w:r>
+    </w:p>
+    <w:p>
+      <w:pPr>
+        <w:jc w:val="center"/>
+        <w:rPr>
+          <w:lang w:val="en-US"/>
+        </w:rPr>
+      </w:pPr>
+      <w:r>
+        <w:rPr>
+          <w:lang w:val="en-US"/>
+        </w:rPr>
+        <w:lastRenderedPageBreak/>
+        <w:drawing>
+          <wp:inline distT="0" distB="0" distL="0" distR="0" wp14:anchorId="2BF381AD" wp14:editId="1D90AD64">
+            <wp:extent cx="3629025" cy="5438775"/>
+            <wp:effectExtent l="0" t="0" r="9525" b="0"/>
+            <wp:docPr id="1715580679" name="Picture 23" descr="A diagram of a flowchart&#10;&#10;Description automatically generated"/>
+            <wp:cNvGraphicFramePr>
+              <a:graphicFrameLocks xmlns:a="http://schemas.openxmlformats.org/drawingml/2006/main" noChangeAspect="1"/>
+            </wp:cNvGraphicFramePr>
+            <a:graphic xmlns:a="http://schemas.openxmlformats.org/drawingml/2006/main">
+              <a:graphicData uri="http://schemas.openxmlformats.org/drawingml/2006/picture">
+                <pic:pic xmlns:pic="http://schemas.openxmlformats.org/drawingml/2006/picture">
+                  <pic:nvPicPr>
+                    <pic:cNvPr id="1715580679" name="Picture 23" descr="A diagram of a flowchart&#10;&#10;Description automatically generated"/>
+                    <pic:cNvPicPr/>
+                  </pic:nvPicPr>
+                  <pic:blipFill>
+                    <a:blip r:embed="rId34">
+                      <a:extLst>
+                        <a:ext uri="{28A0092B-C50C-407E-A947-70E740481C1C}">
+                          <a14:useLocalDpi xmlns:a14="http://schemas.microsoft.com/office/drawing/2010/main" val="0"/>
+                        </a:ext>
+                      </a:extLst>
+                    </a:blip>
+                    <a:stretch>
+                      <a:fillRect/>
+                    </a:stretch>
+                  </pic:blipFill>
+                  <pic:spPr>
+                    <a:xfrm>
+                      <a:off x="0" y="0"/>
+                      <a:ext cx="3629025" cy="5438775"/>
+                    </a:xfrm>
+                    <a:prstGeom prst="rect">
+                      <a:avLst/>
+                    </a:prstGeom>
+                  </pic:spPr>
+                </pic:pic>
+              </a:graphicData>
+            </a:graphic>
+          </wp:inline>
+        </w:drawing>
+      </w:r>
+    </w:p>
+    <w:p>
+      <w:pPr>
+        <w:jc w:val="center"/>
+        <w:rPr>
+          <w:lang w:val="en-US"/>
+        </w:rPr>
+      </w:pPr>
+      <w:r>
+        <w:rPr>
+          <w:b/>
+          <w:bCs/>
+          <w:lang w:val="en-US"/>
+        </w:rPr>
+        <w:t>Hình P.</w:t>
+      </w:r>
+      <w:r>
+        <w:rPr>
+          <w:b/>
+          <w:bCs/>
+          <w:lang w:val="en-US"/>
+        </w:rPr>
+        <w:t>2</w:t>
+      </w:r>
+      <w:r>
+        <w:rPr>
+          <w:b/>
+          <w:bCs/>
+          <w:lang w:val="en-US"/>
+        </w:rPr>
+        <w:t>6</w:t>
+      </w:r>
+      <w:r>
+        <w:rPr>
+          <w:b/>
+          <w:bCs/>
+          <w:lang w:val="en-US"/>
+        </w:rPr>
+        <w:t>:</w:t>
+      </w:r>
+      <w:r>
+        <w:rPr>
+          <w:lang w:val="en-US"/>
+        </w:rPr>
+        <w:t xml:space="preserve"> Biểu đồ </w:t>
+      </w:r>
+      <w:r>
+        <w:rPr>
+          <w:lang w:val="en-US"/>
+        </w:rPr>
+        <w:t xml:space="preserve">trạng thái lớp </w:t>
+      </w:r>
+      <w:r>
+        <w:rPr>
+          <w:lang w:val="en-US"/>
+        </w:rPr>
+        <w:t>làm bài</w:t>
+      </w:r>
+    </w:p>
+    <w:p>
+      <w:pPr>
+        <w:jc w:val="center"/>
+        <w:rPr>
+          <w:lang w:val="en-US"/>
+        </w:rPr>
+      </w:pPr>
+      <w:r>
+        <w:rPr>
+          <w:lang w:val="en-US"/>
+        </w:rPr>
+        <w:lastRenderedPageBreak/>
+        <w:drawing>
+          <wp:inline distT="0" distB="0" distL="0" distR="0" wp14:anchorId="3CCAB04E" wp14:editId="240C195A">
+            <wp:extent cx="2867025" cy="3486150"/>
+            <wp:effectExtent l="0" t="0" r="9525" b="0"/>
+            <wp:docPr id="789149268" name="Picture 24" descr="A screenshot of a diagram&#10;&#10;Description automatically generated"/>
+            <wp:cNvGraphicFramePr>
+              <a:graphicFrameLocks xmlns:a="http://schemas.openxmlformats.org/drawingml/2006/main" noChangeAspect="1"/>
+            </wp:cNvGraphicFramePr>
+            <a:graphic xmlns:a="http://schemas.openxmlformats.org/drawingml/2006/main">
+              <a:graphicData uri="http://schemas.openxmlformats.org/drawingml/2006/picture">
+                <pic:pic xmlns:pic="http://schemas.openxmlformats.org/drawingml/2006/picture">
+                  <pic:nvPicPr>
+                    <pic:cNvPr id="789149268" name="Picture 24" descr="A screenshot of a diagram&#10;&#10;Description automatically generated"/>
+                    <pic:cNvPicPr/>
+                  </pic:nvPicPr>
+                  <pic:blipFill>
+                    <a:blip r:embed="rId35">
+                      <a:extLst>
+                        <a:ext uri="{28A0092B-C50C-407E-A947-70E740481C1C}">
+                          <a14:useLocalDpi xmlns:a14="http://schemas.microsoft.com/office/drawing/2010/main" val="0"/>
+                        </a:ext>
+                      </a:extLst>
+                    </a:blip>
+                    <a:stretch>
+                      <a:fillRect/>
+                    </a:stretch>
+                  </pic:blipFill>
+                  <pic:spPr>
+                    <a:xfrm>
+                      <a:off x="0" y="0"/>
+                      <a:ext cx="2867025" cy="3486150"/>
+                    </a:xfrm>
+                    <a:prstGeom prst="rect">
+                      <a:avLst/>
+                    </a:prstGeom>
+                  </pic:spPr>
+                </pic:pic>
+              </a:graphicData>
+            </a:graphic>
+          </wp:inline>
+        </w:drawing>
+      </w:r>
+    </w:p>
+    <w:p>
+      <w:pPr>
+        <w:jc w:val="center"/>
+        <w:rPr>
+          <w:lang w:val="en-US"/>
+        </w:rPr>
+      </w:pPr>
+      <w:r>
+        <w:rPr>
+          <w:b/>
+          <w:bCs/>
+          <w:lang w:val="en-US"/>
+        </w:rPr>
+        <w:t>Hình P.</w:t>
+      </w:r>
+      <w:r>
+        <w:rPr>
+          <w:b/>
+          <w:bCs/>
+          <w:lang w:val="en-US"/>
+        </w:rPr>
+        <w:t>2</w:t>
+      </w:r>
+      <w:r>
+        <w:rPr>
+          <w:b/>
+          <w:bCs/>
+          <w:lang w:val="en-US"/>
+        </w:rPr>
+        <w:t>7</w:t>
+      </w:r>
+      <w:r>
+        <w:rPr>
+          <w:b/>
+          <w:bCs/>
+          <w:lang w:val="en-US"/>
+        </w:rPr>
+        <w:t>:</w:t>
+      </w:r>
+      <w:r>
+        <w:rPr>
+          <w:lang w:val="en-US"/>
+        </w:rPr>
+        <w:t xml:space="preserve"> Biểu đồ </w:t>
+      </w:r>
+      <w:r>
+        <w:rPr>
+          <w:lang w:val="en-US"/>
+        </w:rPr>
+        <w:t xml:space="preserve">trạng thái lớp </w:t>
+      </w:r>
+      <w:r>
+        <w:rPr>
+          <w:lang w:val="en-US"/>
+        </w:rPr>
+        <w:t>nộp bài</w:t>
+      </w:r>
+    </w:p>
+    <w:p>
+      <w:pPr>
+        <w:jc w:val="center"/>
+        <w:rPr>
+          <w:lang w:val="en-US"/>
+        </w:rPr>
+      </w:pPr>
+    </w:p>
+    <w:p>
+      <w:pPr>
+        <w:jc w:val="center"/>
+        <w:rPr>
+          <w:lang w:val="en-US"/>
+        </w:rPr>
+      </w:pPr>
+      <w:r>
+        <w:rPr>
+          <w:lang w:val="en-US"/>
+        </w:rPr>
+        <w:drawing>
+          <wp:inline distT="0" distB="0" distL="0" distR="0" wp14:anchorId="50B1E9DE" wp14:editId="76DED4A7">
+            <wp:extent cx="4581525" cy="2600325"/>
+            <wp:effectExtent l="0" t="0" r="9525" b="9525"/>
+            <wp:docPr id="1056721955" name="Picture 25" descr="A diagram of a flowchart&#10;&#10;Description automatically generated"/>
+            <wp:cNvGraphicFramePr>
+              <a:graphicFrameLocks xmlns:a="http://schemas.openxmlformats.org/drawingml/2006/main" noChangeAspect="1"/>
+            </wp:cNvGraphicFramePr>
+            <a:graphic xmlns:a="http://schemas.openxmlformats.org/drawingml/2006/main">
+              <a:graphicData uri="http://schemas.openxmlformats.org/drawingml/2006/picture">
+                <pic:pic xmlns:pic="http://schemas.openxmlformats.org/drawingml/2006/picture">
+                  <pic:nvPicPr>
+                    <pic:cNvPr id="1056721955" name="Picture 25" descr="A diagram of a flowchart&#10;&#10;Description automatically generated"/>
+                    <pic:cNvPicPr/>
+                  </pic:nvPicPr>
+                  <pic:blipFill>
+                    <a:blip r:embed="rId36">
+                      <a:extLst>
+                        <a:ext uri="{28A0092B-C50C-407E-A947-70E740481C1C}">
+                          <a14:useLocalDpi xmlns:a14="http://schemas.microsoft.com/office/drawing/2010/main" val="0"/>
+                        </a:ext>
+                      </a:extLst>
+                    </a:blip>
+                    <a:stretch>
+                      <a:fillRect/>
+                    </a:stretch>
+                  </pic:blipFill>
+                  <pic:spPr>
+                    <a:xfrm>
+                      <a:off x="0" y="0"/>
+                      <a:ext cx="4581525" cy="2600325"/>
+                    </a:xfrm>
+                    <a:prstGeom prst="rect">
+                      <a:avLst/>
+                    </a:prstGeom>
+                  </pic:spPr>
+                </pic:pic>
+              </a:graphicData>
+            </a:graphic>
+          </wp:inline>
+        </w:drawing>
+      </w:r>
+    </w:p>
+    <w:p>
+      <w:pPr>
+        <w:jc w:val="center"/>
+        <w:rPr>
+          <w:lang w:val="en-US"/>
+        </w:rPr>
+      </w:pPr>
+      <w:r>
+        <w:rPr>
+          <w:b/>
+          <w:bCs/>
+          <w:lang w:val="en-US"/>
+        </w:rPr>
+        <w:t>Hình P.</w:t>
+      </w:r>
+      <w:r>
+        <w:rPr>
+          <w:b/>
+          <w:bCs/>
+          <w:lang w:val="en-US"/>
+        </w:rPr>
+        <w:t>2</w:t>
+      </w:r>
+      <w:r>
+        <w:rPr>
+          <w:b/>
+          <w:bCs/>
+          <w:lang w:val="en-US"/>
+        </w:rPr>
+        <w:t>8</w:t>
+      </w:r>
+      <w:r>
+        <w:rPr>
+          <w:b/>
+          <w:bCs/>
+          <w:lang w:val="en-US"/>
+        </w:rPr>
+        <w:t>:</w:t>
+      </w:r>
+      <w:r>
+        <w:rPr>
+          <w:lang w:val="en-US"/>
+        </w:rPr>
+        <w:t xml:space="preserve"> Biểu đồ </w:t>
+      </w:r>
+      <w:r>
+        <w:rPr>
+          <w:lang w:val="en-US"/>
+        </w:rPr>
+        <w:t xml:space="preserve">trạng thái lớp </w:t>
+      </w:r>
+      <w:r>
+        <w:rPr>
+          <w:lang w:val="en-US"/>
+        </w:rPr>
+        <w:t>xem kết quả</w:t>
+      </w:r>
+    </w:p>
+    <w:p>
+      <w:pPr>
+        <w:rPr>
+          <w:lang w:val="en-US"/>
+        </w:rPr>
+      </w:pPr>
+      <w:r>
+        <w:rPr>
+          <w:lang w:val="en-US"/>
+        </w:rPr>
+        <w:br w:type="page"/>
+      </w:r>
+    </w:p>
+    <w:p>
+      <w:pPr>
+        <w:rPr>
+          <w:lang w:val="en-US"/>
+        </w:rPr>
+      </w:pPr>
+      <w:r>
+        <w:rPr>
+          <w:b/>
+          <w:bCs/>
+          <w:lang w:val="en-US"/>
+        </w:rPr>
+        <w:lastRenderedPageBreak/>
+        <w:t>3. PHA THIẾT KẾ</w:t>
+      </w:r>
+    </w:p>
+    <w:p>
+      <w:pPr>
+        <w:rPr>
+          <w:lang w:val="en-US"/>
+        </w:rPr>
+      </w:pPr>
+      <w:r>
+        <w:rPr>
+          <w:lang w:val="en-US"/>
+        </w:rPr>
+        <w:t>Trong phần này, tài liệu sẽ trình bày các biểu đồ UML được xây dựng trong pha thiết kế hệ thống Quản lý thư viện. Sau khi xây dựng các biểu đồ tương tác (dạng tuân tự), pha thiết kế sẽ đưa ra biểu đồ lớp thiết kế. Tuy nhiên trong biểu đồ lớp này chưa bổ sung các lớp giao diện và điều khiển. Phần 3.3 sẽ trình bày thiết kế</w:t>
+      </w:r>
+    </w:p>
+    <w:p>
+      <w:pPr>
+        <w:rPr>
+          <w:lang w:val="en-US"/>
+        </w:rPr>
+      </w:pPr>
+    </w:p>
+    <w:p>
+      <w:pPr>
+        <w:jc w:val="center"/>
+        <w:rPr>
+          <w:lang w:val="en-US"/>
+        </w:rPr>
+      </w:pPr>
+    </w:p>
+    <w:p>
+      <w:pPr>
+        <w:jc w:val="center"/>
+        <w:rPr>
+          <w:lang w:val="en-US"/>
+        </w:rPr>
+      </w:pPr>
+    </w:p>
+    <w:p>
+      <w:pPr>
+        <w:jc w:val="center"/>
+        <w:rPr>
+          <w:lang w:val="en-US"/>
+        </w:rPr>
+      </w:pPr>
+    </w:p>
+    <w:p>
+      <w:pPr>
+        <w:jc w:val="center"/>
         <w:rPr>
           <w:lang w:val="en-US"/>
         </w:rPr>
       </w:pPr>
     </w:p>
     <w:sectPr>
-      <w:footerReference w:type="default" r:id="rId24"/>
+      <w:footerReference w:type="default" r:id="rId37"/>
       <w:pgSz w:w="11907" w:h="16840" w:code="9"/>
       <w:pgMar w:top="1134" w:right="1134" w:bottom="1134" w:left="1701" w:header="720" w:footer="720" w:gutter="0"/>
       <w:pgNumType w:start="0"/>
@@ -15872,7 +17408,7 @@
   <w:style w:type="paragraph" w:default="1" w:styleId="Normal">
     <w:name w:val="Normal"/>
     <w:qFormat/>
-    <w:rsid w:val="004E66B5"/>
+    <w:rsid w:val="00D052A3"/>
     <w:rPr>
       <w:noProof/>
       <w:lang w:val="vi-VN"/>

</xml_diff>